<commit_message>
Aligne tous les versets sur la version Segond 21
Les 44 references du document sont desormais citees dans la seule version
Segond 21, chaque texte ayant ete verifie contre une source en ligne.

Corrections de references entrainees par le passage au S21 :
- 1 Pierre 1.21 -> 2 Pierre 1.21 (erreur presente dans le document precedent)
- Levitique 6.13 -> Levitique 6.6 (numerotation S21)
- Psaume 68.11 -> Psaume 68.12 (numerotation S21)
- 2 Pierre 1.5-8 -> 2 Pierre 1.5-6 (etendue reelle de la citation)

Ajout d'une note en fin de page des consignes indiquant la version utilisee,
et harmonisation de quatre formulations de sujets avec le vocabulaire S21.

Co-Authored-By: Claude Opus 5 <noreply@anthropic.com>
Claude-Session: https://claude.ai/code/session_013WPa8GGP988ihdHYSaQ9ok
</commit_message>
<xml_diff>
--- a/documents/Sujets de prière semaine du 20 au 25 septembre 2026.docx
+++ b/documents/Sujets de prière semaine du 20 au 25 septembre 2026.docx
@@ -325,6 +325,27 @@
           <w:sz w:val="28"/>
           <w:szCs w:val="28"/>
         </w:rPr>
+      </w:pPr>
+      <w:r>
+        <w:rPr>
+          <w:rFonts w:ascii="Calibri" w:hAnsi="Calibri" w:cs="Calibri"/>
+          <w:sz w:val="28"/>
+          <w:szCs w:val="28"/>
+        </w:rPr>
+        <w:t xml:space="preserve">Tout ce qui se passe dans le groupe reste dans le groupe. Vous ne devez pas en parler avec des personnes qui ne sont pas reprises dans le groupe.</w:t>
+      </w:r>
+    </w:p>
+    <w:p>
+      <w:pPr>
+        <w:spacing w:before="300"/>
+        <w:ind w:left="165"/>
+        <w:rPr>
+          <w:rFonts w:ascii="Calibri" w:hAnsi="Calibri" w:cs="Calibri"/>
+          <w:b/>
+          <w:i/>
+          <w:sz w:val="28"/>
+          <w:szCs w:val="28"/>
+        </w:rPr>
         <w:sectPr>
           <w:pgSz w:w="11910" w:h="16840"/>
           <w:pgMar w:top="1400" w:right="1275" w:bottom="280" w:left="1275" w:header="720" w:footer="720" w:gutter="0"/>
@@ -334,10 +355,12 @@
       <w:r>
         <w:rPr>
           <w:rFonts w:ascii="Calibri" w:hAnsi="Calibri" w:cs="Calibri"/>
-          <w:sz w:val="28"/>
-          <w:szCs w:val="28"/>
-        </w:rPr>
-        <w:t xml:space="preserve">Tout ce qui se passe dans le groupe reste dans le groupe. Vous ne devez pas en parler avec des personnes qui ne sont pas reprises dans le groupe.</w:t>
+          <w:b/>
+          <w:i/>
+          <w:sz w:val="28"/>
+          <w:szCs w:val="28"/>
+        </w:rPr>
+        <w:t xml:space="preserve">NB : tous les versets de ce document sont cités dans la version Segond 21 (S21).</w:t>
       </w:r>
     </w:p>
     <w:p>
@@ -470,7 +493,7 @@
           <w:szCs w:val="28"/>
           <w:lang w:val="fr-BE"/>
         </w:rPr>
-        <w:t xml:space="preserve">Déclarons que l’église ICC Benelux est plantée près d’un courant d’eau et que tout ce que nous entreprenons dans cette saison réussit par la grâce de DIEU.</w:t>
+        <w:t xml:space="preserve">Déclarons que l’église ICC Benelux est plantée près d’un cours d’eau et que tout ce que nous entreprenons dans cette saison réussit par la grâce de DIEU.</w:t>
       </w:r>
     </w:p>
     <w:p>
@@ -522,7 +545,7 @@
           <w:sz w:val="28"/>
           <w:szCs w:val="28"/>
         </w:rPr>
-        <w:t xml:space="preserve">Psaumes 1.3 - Il est comme un arbre planté près d'un courant d'eau, Qui donne son fruit en sa saison, Et dont le feuillage ne se flétrit point : Tout ce qu'il fait lui réussit.</w:t>
+        <w:t xml:space="preserve">Psaume 1.3 - Il ressemble à un arbre planté près d’un cours d’eau : il donne son fruit en sa saison, et son feuillage ne se flétrit pas. Tout ce qu’il fait lui réussit.</w:t>
       </w:r>
     </w:p>
     <w:p>
@@ -584,7 +607,7 @@
           <w:szCs w:val="28"/>
           <w:lang w:val="fr-BE"/>
         </w:rPr>
-        <w:t xml:space="preserve">Proclamons que les limites de l’église ICC Benelux sont repoussées. DIEU élargit nos tentes, allonge nos cordages et affermit nos pieux dans tous les territoires où Il nous a établis.</w:t>
+        <w:t xml:space="preserve">Proclamons que les limites de l’église ICC Benelux sont repoussées. DIEU agrandit l’espace de nos tentes, allonge nos cordages et renforce nos piquets dans tous les territoires où Il nous a établis.</w:t>
       </w:r>
     </w:p>
     <w:p>
@@ -636,7 +659,7 @@
           <w:sz w:val="28"/>
           <w:szCs w:val="28"/>
         </w:rPr>
-        <w:t xml:space="preserve">Ésaïe 54.2-3 - Élargis l'espace de ta tente ; Étends les tapis de ton habitation : ne retiens pas ! Allonge tes cordages, et affermis tes pieux ! Car tu te répandras à droite et à gauche.</w:t>
+        <w:t xml:space="preserve">Ésaïe 54.2-3 - Agrandis l’espace de ta tente ! Qu’on déplie les toiles qui te servent d’habitation : n’en retiens rien ! Allonge tes cordages et renforce tes piquets ! En effet, tu déborderas à droite et à gauche, ta descendance envahira des nations et peuplera des villes désertes.</w:t>
       </w:r>
     </w:p>
     <w:p>
@@ -725,32 +748,32 @@
           <w:szCs w:val="28"/>
           <w:lang w:val="fr-BE"/>
         </w:rPr>
-        <w:t xml:space="preserve">Proclamons que nous sommes transformés en la même image, de gloire en gloire, et que la Gloire de cette maison est plus grande que celle du passé.</w:t>
-      </w:r>
-    </w:p>
-    <w:p>
-      <w:pPr>
-        <w:pStyle w:val="Corpsdetexte"/>
-        <w:spacing w:before="90"/>
-        <w:ind w:left="145"/>
-        <w:jc w:val="both"/>
-        <w:rPr>
-          <w:rFonts w:ascii="Calibri" w:hAnsi="Calibri" w:cs="Calibri"/>
-          <w:iCs/>
-          <w:color w:val="548DD4" w:themeColor="text2" w:themeTint="99"/>
-          <w:sz w:val="28"/>
-          <w:szCs w:val="28"/>
-        </w:rPr>
-      </w:pPr>
-      <w:r>
-        <w:rPr>
-          <w:rFonts w:ascii="Calibri" w:hAnsi="Calibri" w:cs="Calibri"/>
-          <w:iCs/>
-          <w:color w:val="548DD4" w:themeColor="text2" w:themeTint="99"/>
-          <w:sz w:val="28"/>
-          <w:szCs w:val="28"/>
-        </w:rPr>
-        <w:t xml:space="preserve">Aggée 2.9 - La gloire de cette dernière maison sera plus grande que celle de la première, dit l'Éternel des armées ; et c'est dans ce lieu que Je donnerai la paix.</w:t>
+        <w:t xml:space="preserve">Proclamons que la Gloire de ce dernier temple est plus grande que celle du premier, et que DIEU donne Sa paix dans cette maison.</w:t>
+      </w:r>
+    </w:p>
+    <w:p>
+      <w:pPr>
+        <w:pStyle w:val="Corpsdetexte"/>
+        <w:spacing w:before="90"/>
+        <w:ind w:left="145"/>
+        <w:jc w:val="both"/>
+        <w:rPr>
+          <w:rFonts w:ascii="Calibri" w:hAnsi="Calibri" w:cs="Calibri"/>
+          <w:iCs/>
+          <w:color w:val="548DD4" w:themeColor="text2" w:themeTint="99"/>
+          <w:sz w:val="28"/>
+          <w:szCs w:val="28"/>
+        </w:rPr>
+      </w:pPr>
+      <w:r>
+        <w:rPr>
+          <w:rFonts w:ascii="Calibri" w:hAnsi="Calibri" w:cs="Calibri"/>
+          <w:iCs/>
+          <w:color w:val="548DD4" w:themeColor="text2" w:themeTint="99"/>
+          <w:sz w:val="28"/>
+          <w:szCs w:val="28"/>
+        </w:rPr>
+        <w:t xml:space="preserve">Aggée 2.9 - La gloire de ce dernier temple sera plus grande que celle du premier, dit l’Eternel, le maître de l’univers, et c’est dans ce lieu que je donnerai la paix, déclare l’Eternel, le maître de l’univers.</w:t>
       </w:r>
     </w:p>
     <w:p>
@@ -837,7 +860,7 @@
           <w:sz w:val="28"/>
           <w:szCs w:val="28"/>
         </w:rPr>
-        <w:t xml:space="preserve">Ésaïe 40.31 Ceux qui se confient en l’Éternel renouvellent leur force. Ils prennent le vol comme les aigles ; ils courent, et ne se lassent point, ils marchent, et ne se fatiguent point.</w:t>
+        <w:t xml:space="preserve">Ésaïe 40.31 Mais ceux qui comptent sur l’Eternel renouvellent leur force. Ils prennent leur envol comme les aigles. Ils courent sans s’épuiser, ils marchent sans se fatiguer.</w:t>
       </w:r>
     </w:p>
     <w:p>
@@ -964,7 +987,7 @@
           <w:sz w:val="28"/>
           <w:szCs w:val="28"/>
         </w:rPr>
-        <w:t xml:space="preserve">Psaumes 26.6-7 Je lave mes mains dans l'innocence, Et je vais autour de ton autel, ô ÉTERNEL ! Pour éclater en actions de grâces, Et raconter toutes Tes merveilles.</w:t>
+        <w:t xml:space="preserve">Psaume 26.6-7 - Je lave mes mains en signe d’innocence, et je fais le tour de ton autel, Eternel, pour exprimer ma reconnaissance et raconter toutes tes merveilles.</w:t>
       </w:r>
     </w:p>
     <w:p>
@@ -1051,7 +1074,7 @@
           <w:sz w:val="28"/>
           <w:szCs w:val="28"/>
         </w:rPr>
-        <w:t xml:space="preserve">Actes 9.31 – L'Église était en paix dans toute la Judée, la Galilée et la Samarie, s'édifiant et marchant dans la crainte du SEIGNEUR, et elle s'accroissait par l'assistance du SAINT ESPRIT.</w:t>
+        <w:t xml:space="preserve">Actes 9.31 - L’Eglise était en paix dans toute la Judée, la Galilée et la Samarie ; elle s’édifiait, marchait dans la crainte du Seigneur et grandissait grâce à l’aide du Saint-Esprit.</w:t>
       </w:r>
     </w:p>
     <w:p>
@@ -1165,7 +1188,7 @@
           <w:sz w:val="28"/>
           <w:szCs w:val="28"/>
         </w:rPr>
-        <w:t xml:space="preserve">Marc 3.27 – Personne ne peut entrer dans la maison d'un homme fort et piller ses biens, sans avoir auparavant lié cet homme fort ; alors il pillera sa maison.</w:t>
+        <w:t xml:space="preserve">Marc 3.27 - Personne ne peut entrer dans la maison d’un homme fort et piller ses biens sans avoir d’abord attaché cet homme fort ; alors seulement il pillera sa maison.</w:t>
       </w:r>
     </w:p>
     <w:p>
@@ -1252,7 +1275,7 @@
           <w:sz w:val="28"/>
           <w:szCs w:val="28"/>
         </w:rPr>
-        <w:t xml:space="preserve">Ésaïe 40.31 Ceux qui se confient en l’Éternel renouvellent leur force. Ils prennent le vol comme les aigles ; ils courent, et ne se lassent point, ils marchent, et ne se fatiguent point.</w:t>
+        <w:t xml:space="preserve">Ésaïe 40.31 Mais ceux qui comptent sur l’Eternel renouvellent leur force. Ils prennent leur envol comme les aigles. Ils courent sans s’épuiser, ils marchent sans se fatiguer.</w:t>
       </w:r>
     </w:p>
     <w:p>
@@ -1379,7 +1402,7 @@
           <w:sz w:val="28"/>
           <w:szCs w:val="28"/>
         </w:rPr>
-        <w:t xml:space="preserve">Philippiens 2.29 – Recevez-le donc dans le Seigneur avec une joie entière, et honorez de tels hommes.</w:t>
+        <w:t xml:space="preserve">Philippiens 2.29 - Accueillez-le dans le Seigneur avec une joie sans réserve et ayez de l’estime pour de tels hommes.</w:t>
       </w:r>
     </w:p>
     <w:p>
@@ -1466,7 +1489,7 @@
           <w:sz w:val="28"/>
           <w:szCs w:val="28"/>
         </w:rPr>
-        <w:t xml:space="preserve">Psaumes 2.8 – Demande-moi et Je te donnerai les nations pour héritage, Les extrémités de la terre pour possession.</w:t>
+        <w:t xml:space="preserve">Psaume 2.8 - Demande-le-moi, et je te donnerai les nations en héritage, les extrémités de la terre en possession.</w:t>
       </w:r>
     </w:p>
     <w:p>
@@ -1580,7 +1603,7 @@
           <w:sz w:val="28"/>
           <w:szCs w:val="28"/>
         </w:rPr>
-        <w:t xml:space="preserve">Galates 1.15-16 – Mais, lorsqu'il plut à Celui qui m'avait mis à part dès le sein de ma mère, et qui m'a appelé par sa grâce, de révéler en moi son Fils (…)</w:t>
+        <w:t xml:space="preserve">Galates 1.15-16 - Mais Dieu m’avait mis à part dès le ventre de ma mère et m’a appelé par sa grâce. Lorsqu’il a trouvé bon de révéler son Fils en moi afin que je l’annonce parmi les non-Juifs (…)</w:t>
       </w:r>
     </w:p>
     <w:p>
@@ -1667,7 +1690,7 @@
           <w:sz w:val="28"/>
           <w:szCs w:val="28"/>
         </w:rPr>
-        <w:t xml:space="preserve">Ésaïe 40.31 Ceux qui se confient en l’Éternel renouvellent leur force. Ils prennent le vol comme les aigles ; ils courent, et ne se lassent point, ils marchent, et ne se fatiguent point.</w:t>
+        <w:t xml:space="preserve">Ésaïe 40.31 Mais ceux qui comptent sur l’Eternel renouvellent leur force. Ils prennent leur envol comme les aigles. Ils courent sans s’épuiser, ils marchent sans se fatiguer.</w:t>
       </w:r>
     </w:p>
     <w:p>
@@ -1840,7 +1863,7 @@
           <w:sz w:val="28"/>
           <w:szCs w:val="28"/>
         </w:rPr>
-        <w:t xml:space="preserve">Éphésiens 5.20 Rendez continuellement grâce pour toutes choses à DIEU le Père, au Nom de Notre Seigneur JESUS-CHRIST.</w:t>
+        <w:t xml:space="preserve">Éphésiens 5.20 - Remerciez constamment Dieu le Père pour tout, au nom de notre Seigneur Jésus-Christ.</w:t>
       </w:r>
     </w:p>
     <w:p>
@@ -1927,7 +1950,7 @@
           <w:sz w:val="28"/>
           <w:szCs w:val="28"/>
         </w:rPr>
-        <w:t xml:space="preserve">Jacques 1.22 Mettez en pratique la Parole, et ne vous bornez pas à L'écouter, en vous trompant vous-mêmes par de faux raisonnements.</w:t>
+        <w:t xml:space="preserve">Jacques 1.22 - Mettez en pratique la parole et ne vous contentez pas de l’écouter en vous trompant vous-mêmes par de faux raisonnements.</w:t>
       </w:r>
     </w:p>
     <w:p>
@@ -2014,7 +2037,7 @@
           <w:sz w:val="28"/>
           <w:szCs w:val="28"/>
         </w:rPr>
-        <w:t xml:space="preserve">Mathieu 7.7 Demandez, et l'on vous donnera ; cherchez, et vous trouverez ; frappez, et l'on vous ouvrira.</w:t>
+        <w:t xml:space="preserve">Matthieu 7.7 - Demandez et l’on vous donnera, cherchez et vous trouverez, frappez et l’on vous ouvrira.</w:t>
       </w:r>
     </w:p>
     <w:p>
@@ -2128,32 +2151,32 @@
           <w:sz w:val="28"/>
           <w:szCs w:val="28"/>
         </w:rPr>
-        <w:t xml:space="preserve">Psaume 37.5 Recommande ton sort à l’Eternel, mets ta confiance en Lui, et Il agira.</w:t>
-      </w:r>
-    </w:p>
-    <w:p>
-      <w:pPr>
-        <w:pStyle w:val="Corpsdetexte"/>
-        <w:spacing w:before="90"/>
-        <w:ind w:left="145"/>
-        <w:jc w:val="both"/>
-        <w:rPr>
-          <w:rFonts w:ascii="Calibri" w:hAnsi="Calibri" w:cs="Calibri"/>
-          <w:iCs/>
-          <w:color w:val="548DD4" w:themeColor="text2" w:themeTint="99"/>
-          <w:sz w:val="28"/>
-          <w:szCs w:val="28"/>
-        </w:rPr>
-      </w:pPr>
-      <w:r>
-        <w:rPr>
-          <w:rFonts w:ascii="Calibri" w:hAnsi="Calibri" w:cs="Calibri"/>
-          <w:iCs/>
-          <w:color w:val="548DD4" w:themeColor="text2" w:themeTint="99"/>
-          <w:sz w:val="28"/>
-          <w:szCs w:val="28"/>
-        </w:rPr>
-        <w:t xml:space="preserve">Galates 4.1 Voici ce que je veux dire : Aussi longtemps que l’héritier est un enfant, il ne diffère en rien d’un esclave, quoiqu’il soit le maître de tout.</w:t>
+        <w:t xml:space="preserve">Psaume 37.5 - Recommande ton sort à l’Eternel, mets ta confiance en lui, et il agira.</w:t>
+      </w:r>
+    </w:p>
+    <w:p>
+      <w:pPr>
+        <w:pStyle w:val="Corpsdetexte"/>
+        <w:spacing w:before="90"/>
+        <w:ind w:left="145"/>
+        <w:jc w:val="both"/>
+        <w:rPr>
+          <w:rFonts w:ascii="Calibri" w:hAnsi="Calibri" w:cs="Calibri"/>
+          <w:iCs/>
+          <w:color w:val="548DD4" w:themeColor="text2" w:themeTint="99"/>
+          <w:sz w:val="28"/>
+          <w:szCs w:val="28"/>
+        </w:rPr>
+      </w:pPr>
+      <w:r>
+        <w:rPr>
+          <w:rFonts w:ascii="Calibri" w:hAnsi="Calibri" w:cs="Calibri"/>
+          <w:iCs/>
+          <w:color w:val="548DD4" w:themeColor="text2" w:themeTint="99"/>
+          <w:sz w:val="28"/>
+          <w:szCs w:val="28"/>
+        </w:rPr>
+        <w:t xml:space="preserve">Galates 4.1 - Voici ce que je veux dire : aussi longtemps que l’héritier est un enfant, il ne diffère en rien d’un esclave, quoiqu’il soit le maître de tout.</w:t>
       </w:r>
     </w:p>
     <w:p>
@@ -2240,7 +2263,7 @@
           <w:sz w:val="28"/>
           <w:szCs w:val="28"/>
         </w:rPr>
-        <w:t xml:space="preserve">Ésaïe 40.31 Ceux qui se confient en l’Éternel renouvellent leur force. Ils prennent le vol comme les aigles ; ils courent, et ne se lassent point, ils marchent, et ne se fatiguent point.</w:t>
+        <w:t xml:space="preserve">Ésaïe 40.31 Mais ceux qui comptent sur l’Eternel renouvellent leur force. Ils prennent leur envol comme les aigles. Ils courent sans s’épuiser, ils marchent sans se fatiguer.</w:t>
       </w:r>
     </w:p>
     <w:p>
@@ -2367,7 +2390,7 @@
           <w:sz w:val="28"/>
           <w:szCs w:val="28"/>
         </w:rPr>
-        <w:t xml:space="preserve">Psaume 126.3 L’Éternel a fait pour nous de grandes choses ; Nous sommes dans la joie.</w:t>
+        <w:t xml:space="preserve">Psaume 126.3 - Oui, l’Eternel a fait de grandes choses pour nous, et nous sommes dans la joie.</w:t>
       </w:r>
     </w:p>
     <w:p>
@@ -2481,32 +2504,32 @@
           <w:sz w:val="28"/>
           <w:szCs w:val="28"/>
         </w:rPr>
-        <w:t xml:space="preserve">Colossiens 2.6-7 ...marchez en Lui, étant enracinés et fondés en Lui, et affermis par la foi.</w:t>
-      </w:r>
-    </w:p>
-    <w:p>
-      <w:pPr>
-        <w:pStyle w:val="Corpsdetexte"/>
-        <w:spacing w:before="90"/>
-        <w:ind w:left="145"/>
-        <w:jc w:val="both"/>
-        <w:rPr>
-          <w:rFonts w:ascii="Calibri" w:hAnsi="Calibri" w:cs="Calibri"/>
-          <w:iCs/>
-          <w:color w:val="548DD4" w:themeColor="text2" w:themeTint="99"/>
-          <w:sz w:val="28"/>
-          <w:szCs w:val="28"/>
-        </w:rPr>
-      </w:pPr>
-      <w:r>
-        <w:rPr>
-          <w:rFonts w:ascii="Calibri" w:hAnsi="Calibri" w:cs="Calibri"/>
-          <w:iCs/>
-          <w:color w:val="548DD4" w:themeColor="text2" w:themeTint="99"/>
-          <w:sz w:val="28"/>
-          <w:szCs w:val="28"/>
-        </w:rPr>
-        <w:t xml:space="preserve">1 Corinthiens 3.6 J’ai planté, Apollos a arrosé, mais DIEU a fait croître.</w:t>
+        <w:t xml:space="preserve">Colossiens 2.6-7 - Ainsi donc, tout comme vous avez accueilli le Seigneur Jésus-Christ, marchez en lui ; soyez enracinés et fondés en lui, affermis dans la foi telle qu’elle vous a été enseignée.</w:t>
+      </w:r>
+    </w:p>
+    <w:p>
+      <w:pPr>
+        <w:pStyle w:val="Corpsdetexte"/>
+        <w:spacing w:before="90"/>
+        <w:ind w:left="145"/>
+        <w:jc w:val="both"/>
+        <w:rPr>
+          <w:rFonts w:ascii="Calibri" w:hAnsi="Calibri" w:cs="Calibri"/>
+          <w:iCs/>
+          <w:color w:val="548DD4" w:themeColor="text2" w:themeTint="99"/>
+          <w:sz w:val="28"/>
+          <w:szCs w:val="28"/>
+        </w:rPr>
+      </w:pPr>
+      <w:r>
+        <w:rPr>
+          <w:rFonts w:ascii="Calibri" w:hAnsi="Calibri" w:cs="Calibri"/>
+          <w:iCs/>
+          <w:color w:val="548DD4" w:themeColor="text2" w:themeTint="99"/>
+          <w:sz w:val="28"/>
+          <w:szCs w:val="28"/>
+        </w:rPr>
+        <w:t xml:space="preserve">1 Corinthiens 3.6 - J’ai planté, Apollos a arrosé, mais c’est Dieu qui a fait grandir.</w:t>
       </w:r>
     </w:p>
     <w:p>
@@ -2620,32 +2643,32 @@
           <w:sz w:val="28"/>
           <w:szCs w:val="28"/>
         </w:rPr>
-        <w:t xml:space="preserve">Actes 2.47 Et le Seigneur ajoutait chaque jour à l'Église ceux qui étaient sauvés.</w:t>
-      </w:r>
-    </w:p>
-    <w:p>
-      <w:pPr>
-        <w:pStyle w:val="Corpsdetexte"/>
-        <w:spacing w:before="90"/>
-        <w:ind w:left="145"/>
-        <w:jc w:val="both"/>
-        <w:rPr>
-          <w:rFonts w:ascii="Calibri" w:hAnsi="Calibri" w:cs="Calibri"/>
-          <w:iCs/>
-          <w:color w:val="548DD4" w:themeColor="text2" w:themeTint="99"/>
-          <w:sz w:val="28"/>
-          <w:szCs w:val="28"/>
-        </w:rPr>
-      </w:pPr>
-      <w:r>
-        <w:rPr>
-          <w:rFonts w:ascii="Calibri" w:hAnsi="Calibri" w:cs="Calibri"/>
-          <w:iCs/>
-          <w:color w:val="548DD4" w:themeColor="text2" w:themeTint="99"/>
-          <w:sz w:val="28"/>
-          <w:szCs w:val="28"/>
-        </w:rPr>
-        <w:t xml:space="preserve">Matthieu 9.37-38 La moisson est grande, mais il y a peu d'ouvriers. Priez donc le maître de la moisson d'envoyer des ouvriers dans sa moisson.</w:t>
+        <w:t xml:space="preserve">Actes 2.47 - Ils louaient Dieu et avaient la faveur de tout le peuple. Le Seigneur ajoutait chaque jour à l’Eglise ceux qui étaient sauvés.</w:t>
+      </w:r>
+    </w:p>
+    <w:p>
+      <w:pPr>
+        <w:pStyle w:val="Corpsdetexte"/>
+        <w:spacing w:before="90"/>
+        <w:ind w:left="145"/>
+        <w:jc w:val="both"/>
+        <w:rPr>
+          <w:rFonts w:ascii="Calibri" w:hAnsi="Calibri" w:cs="Calibri"/>
+          <w:iCs/>
+          <w:color w:val="548DD4" w:themeColor="text2" w:themeTint="99"/>
+          <w:sz w:val="28"/>
+          <w:szCs w:val="28"/>
+        </w:rPr>
+      </w:pPr>
+      <w:r>
+        <w:rPr>
+          <w:rFonts w:ascii="Calibri" w:hAnsi="Calibri" w:cs="Calibri"/>
+          <w:iCs/>
+          <w:color w:val="548DD4" w:themeColor="text2" w:themeTint="99"/>
+          <w:sz w:val="28"/>
+          <w:szCs w:val="28"/>
+        </w:rPr>
+        <w:t xml:space="preserve">Matthieu 9.37-38 - Alors il dit à ses disciples : « La moisson est grande, mais il y a peu d’ouvriers. Priez donc le maître de la moisson d’envoyer des ouvriers dans sa moisson. »</w:t>
       </w:r>
     </w:p>
     <w:p>
@@ -2732,7 +2755,7 @@
           <w:sz w:val="28"/>
           <w:szCs w:val="28"/>
         </w:rPr>
-        <w:t xml:space="preserve">Ésaïe 40.31 Ceux qui se confient en l’Éternel renouvellent leur force. Ils prennent le vol comme les aigles ; ils courent, et ne se lassent point, ils marchent, et ne se fatiguent point.</w:t>
+        <w:t xml:space="preserve">Ésaïe 40.31 Mais ceux qui comptent sur l’Eternel renouvellent leur force. Ils prennent leur envol comme les aigles. Ils courent sans s’épuiser, ils marchent sans se fatiguer.</w:t>
       </w:r>
     </w:p>
     <w:p>
@@ -2886,7 +2909,7 @@
           <w:sz w:val="28"/>
           <w:szCs w:val="28"/>
         </w:rPr>
-        <w:t xml:space="preserve">Mathieu 16.18 Tu es Pierre, et sur cette pierre Je bâtirai mon Église ; et les portes du séjour des morts ne prévaudront point contre elle.</w:t>
+        <w:t xml:space="preserve">Matthieu 16.18 - Et moi, je te dis que tu es Pierre et que sur ce rocher je construirai mon Eglise, et les portes du séjour des morts ne l’emporteront pas sur elle.</w:t>
       </w:r>
     </w:p>
     <w:p>
@@ -3000,32 +3023,32 @@
           <w:sz w:val="28"/>
           <w:szCs w:val="28"/>
         </w:rPr>
-        <w:t xml:space="preserve">Joël 2.25-26 Je vous rendrai les années qu’ont dévorées la sauterelle ... vous mangerez et vous serez rassasiés, et vous célébrerez le Nom de L’Eternel, votre DIEU, qui aura fait pour vous des prodiges.</w:t>
-      </w:r>
-    </w:p>
-    <w:p>
-      <w:pPr>
-        <w:pStyle w:val="Corpsdetexte"/>
-        <w:spacing w:before="90"/>
-        <w:ind w:left="145"/>
-        <w:jc w:val="both"/>
-        <w:rPr>
-          <w:rFonts w:ascii="Calibri" w:hAnsi="Calibri" w:cs="Calibri"/>
-          <w:iCs/>
-          <w:color w:val="548DD4" w:themeColor="text2" w:themeTint="99"/>
-          <w:sz w:val="28"/>
-          <w:szCs w:val="28"/>
-        </w:rPr>
-      </w:pPr>
-      <w:r>
-        <w:rPr>
-          <w:rFonts w:ascii="Calibri" w:hAnsi="Calibri" w:cs="Calibri"/>
-          <w:iCs/>
-          <w:color w:val="548DD4" w:themeColor="text2" w:themeTint="99"/>
-          <w:sz w:val="28"/>
-          <w:szCs w:val="28"/>
-        </w:rPr>
-        <w:t xml:space="preserve">Actes 15.16 Je bâtirai de nouveau la tente de David qui est tombée, j’en réparerai les ruines, et je la redresserai.</w:t>
+        <w:t xml:space="preserve">Joël 2.25-26 - Je vous remplacerai les années qu’ont dévorées la sauterelle, le grillon, le criquet et la chenille, ma grande armée que j’avais envoyée contre vous. Vous mangerez et vous vous rassasierez, vous célébrerez le nom de l’Eternel, votre Dieu, qui aura fait pour vous des prodiges.</w:t>
+      </w:r>
+    </w:p>
+    <w:p>
+      <w:pPr>
+        <w:pStyle w:val="Corpsdetexte"/>
+        <w:spacing w:before="90"/>
+        <w:ind w:left="145"/>
+        <w:jc w:val="both"/>
+        <w:rPr>
+          <w:rFonts w:ascii="Calibri" w:hAnsi="Calibri" w:cs="Calibri"/>
+          <w:iCs/>
+          <w:color w:val="548DD4" w:themeColor="text2" w:themeTint="99"/>
+          <w:sz w:val="28"/>
+          <w:szCs w:val="28"/>
+        </w:rPr>
+      </w:pPr>
+      <w:r>
+        <w:rPr>
+          <w:rFonts w:ascii="Calibri" w:hAnsi="Calibri" w:cs="Calibri"/>
+          <w:iCs/>
+          <w:color w:val="548DD4" w:themeColor="text2" w:themeTint="99"/>
+          <w:sz w:val="28"/>
+          <w:szCs w:val="28"/>
+        </w:rPr>
+        <w:t xml:space="preserve">Actes 15.16 - Après cela, je reviendrai, je relèverai de sa chute la tente de David, je réparerai ses ruines et je la redresserai.</w:t>
       </w:r>
     </w:p>
     <w:p>
@@ -3087,7 +3110,7 @@
           <w:szCs w:val="28"/>
           <w:lang w:val="fr-BE"/>
         </w:rPr>
-        <w:t xml:space="preserve">Prions que le SEIGNEUR conduise à leur terme les travaux du nouveau bâtiment d’ICC Liège. Que les mains qui ont commencé cette œuvre l’achèvent, sans retard, sans accident et sans manquement.</w:t>
+        <w:t xml:space="preserve">Prions que le SEIGNEUR conduise à leur terme les travaux du nouveau bâtiment d’ICC Liège. Que les mains qui ont posé les fondations de cette œuvre la terminent, sans retard, sans accident et sans manquement.</w:t>
       </w:r>
     </w:p>
     <w:p>
@@ -3139,32 +3162,32 @@
           <w:sz w:val="28"/>
           <w:szCs w:val="28"/>
         </w:rPr>
-        <w:t xml:space="preserve">Zacharie 4.9 Les mains de Zorobabel ont fondé cette maison, et ses mains l'achèveront ; et tu sauras que l'Éternel des armées m'a envoyé vers vous.</w:t>
-      </w:r>
-    </w:p>
-    <w:p>
-      <w:pPr>
-        <w:pStyle w:val="Corpsdetexte"/>
-        <w:spacing w:before="90"/>
-        <w:ind w:left="145"/>
-        <w:jc w:val="both"/>
-        <w:rPr>
-          <w:rFonts w:ascii="Calibri" w:hAnsi="Calibri" w:cs="Calibri"/>
-          <w:iCs/>
-          <w:color w:val="548DD4" w:themeColor="text2" w:themeTint="99"/>
-          <w:sz w:val="28"/>
-          <w:szCs w:val="28"/>
-        </w:rPr>
-      </w:pPr>
-      <w:r>
-        <w:rPr>
-          <w:rFonts w:ascii="Calibri" w:hAnsi="Calibri" w:cs="Calibri"/>
-          <w:iCs/>
-          <w:color w:val="548DD4" w:themeColor="text2" w:themeTint="99"/>
-          <w:sz w:val="28"/>
-          <w:szCs w:val="28"/>
-        </w:rPr>
-        <w:t xml:space="preserve">Esaïe 60.22 Le plus petit deviendra un millier, Et le moindre une nation puissante. Moi, l'Éternel, je hâterai ces choses en leur temps.</w:t>
+        <w:t xml:space="preserve">Zacharie 4.9 - Les mains de Zorobabel ont posé les fondations de ce temple, et ses mains le termineront. Tu sauras alors que l’Eternel, le maître de l’univers, m’a envoyé vers vous.</w:t>
+      </w:r>
+    </w:p>
+    <w:p>
+      <w:pPr>
+        <w:pStyle w:val="Corpsdetexte"/>
+        <w:spacing w:before="90"/>
+        <w:ind w:left="145"/>
+        <w:jc w:val="both"/>
+        <w:rPr>
+          <w:rFonts w:ascii="Calibri" w:hAnsi="Calibri" w:cs="Calibri"/>
+          <w:iCs/>
+          <w:color w:val="548DD4" w:themeColor="text2" w:themeTint="99"/>
+          <w:sz w:val="28"/>
+          <w:szCs w:val="28"/>
+        </w:rPr>
+      </w:pPr>
+      <w:r>
+        <w:rPr>
+          <w:rFonts w:ascii="Calibri" w:hAnsi="Calibri" w:cs="Calibri"/>
+          <w:iCs/>
+          <w:color w:val="548DD4" w:themeColor="text2" w:themeTint="99"/>
+          <w:sz w:val="28"/>
+          <w:szCs w:val="28"/>
+        </w:rPr>
+        <w:t xml:space="preserve">Ésaïe 60.22 - Le plus petit se transformera en millier et le plus insignifiant en nation puissante. C’est moi, l’Eternel, qui ferai survenir cela très vite, au moment voulu.</w:t>
       </w:r>
     </w:p>
     <w:p>
@@ -3251,7 +3274,7 @@
           <w:sz w:val="28"/>
           <w:szCs w:val="28"/>
         </w:rPr>
-        <w:t xml:space="preserve">Ésaïe 40.31 Ceux qui se confient en l’Éternel renouvellent leur force. Ils prennent le vol comme les aigles ; ils courent, et ne se lassent point, ils marchent, et ne se fatiguent point.</w:t>
+        <w:t xml:space="preserve">Ésaïe 40.31 Mais ceux qui comptent sur l’Eternel renouvellent leur force. Ils prennent leur envol comme les aigles. Ils courent sans s’épuiser, ils marchent sans se fatiguer.</w:t>
       </w:r>
     </w:p>
     <w:p>
@@ -3478,7 +3501,7 @@
           <w:sz w:val="28"/>
           <w:szCs w:val="28"/>
         </w:rPr>
-        <w:t xml:space="preserve">Ézéchiel 38.23 - Ainsi, Je manifesterai Ma Grandeur et Ma Sainteté et Je me ferai connaître aux yeux de beaucoup de nations. Elles reconnaîtront alors que Je suis l'Eternel.</w:t>
+        <w:t xml:space="preserve">Ézéchiel 38.23 - Ainsi, je manifesterai ma grandeur et ma sainteté et je me ferai connaître aux yeux de beaucoup de nations. Elles reconnaîtront alors que je suis l’Eternel.</w:t>
       </w:r>
     </w:p>
     <w:p>
@@ -3619,7 +3642,7 @@
           <w:sz w:val="28"/>
           <w:szCs w:val="28"/>
         </w:rPr>
-        <w:t xml:space="preserve">Ésaïe 61.11 - Car, comme la terre fait éclore son germe, Et comme un jardin fait pousser ses semences, Ainsi le Seigneur, l'Eternel, fera germer le Salut et la louange, En présence de toutes les nations.</w:t>
+        <w:t xml:space="preserve">Ésaïe 61.11 - En effet, tout comme la terre fait sortir son germe, tout comme un jardin fait pousser ses semences, le Seigneur, l’Eternel, fera pousser la justice et la louange devant toutes les nations.</w:t>
       </w:r>
     </w:p>
     <w:p>
@@ -3733,7 +3756,7 @@
           <w:sz w:val="28"/>
           <w:szCs w:val="28"/>
         </w:rPr>
-        <w:t xml:space="preserve">Matthieu 10.1 – Puis, ayant appelé ses douze disciples, Il leur donna le pouvoir de chasser les esprits impurs, et de guérir toute maladie et toute infirmité.</w:t>
+        <w:t xml:space="preserve">Matthieu 10.1 - Puis Jésus appela ses douze disciples et leur donna le pouvoir de chasser les esprits impurs et de guérir toute maladie et toute infirmité.</w:t>
       </w:r>
     </w:p>
     <w:p>
@@ -3820,7 +3843,7 @@
           <w:sz w:val="28"/>
           <w:szCs w:val="28"/>
         </w:rPr>
-        <w:t xml:space="preserve">Ésaïe 40.31 Ceux qui se confient en l’Éternel renouvellent leur force. Ils prennent le vol comme les aigles ; ils courent, et ne se lassent point, ils marchent, et ne se fatiguent point.</w:t>
+        <w:t xml:space="preserve">Ésaïe 40.31 Mais ceux qui comptent sur l’Eternel renouvellent leur force. Ils prennent leur envol comme les aigles. Ils courent sans s’épuiser, ils marchent sans se fatiguer.</w:t>
       </w:r>
     </w:p>
     <w:p>
@@ -3974,7 +3997,7 @@
           <w:sz w:val="28"/>
           <w:szCs w:val="28"/>
         </w:rPr>
-        <w:t xml:space="preserve">Proverbe 3.6 - Reconnais-Le dans tout ce que tu fais, et Lui, Il guidera tes pas.</w:t>
+        <w:t xml:space="preserve">Proverbes 3.6 - Reconnais-le dans toutes tes voies et il rendra tes sentiers droits.</w:t>
       </w:r>
     </w:p>
     <w:p>
@@ -4088,7 +4111,7 @@
           <w:sz w:val="28"/>
           <w:szCs w:val="28"/>
         </w:rPr>
-        <w:t xml:space="preserve">1 Pierre 1.21 - Ce n'est pas par une volonté d'homme qu'une prophétie a jamais été apportée, mais c'est poussé par le SAINT ESPRIT que des hommes ont parlé de la part de DIEU.</w:t>
+        <w:t xml:space="preserve">2 Pierre 1.21 - Ce n’est jamais par une volonté d’homme qu’une prophétie a été apportée, mais c’est poussés par le Saint-Esprit que des hommes ont parlé de la part de Dieu.</w:t>
       </w:r>
     </w:p>
     <w:p>
@@ -4202,7 +4225,7 @@
           <w:sz w:val="28"/>
           <w:szCs w:val="28"/>
         </w:rPr>
-        <w:t xml:space="preserve">Psaumes 68.11 Le Seigneur donne l'ordre, et les messagères de bonnes nouvelles sont une grande armée.</w:t>
+        <w:t xml:space="preserve">Psaume 68.12 - Le Seigneur dit une parole, et les messagères de bonnes nouvelles sont légion.</w:t>
       </w:r>
     </w:p>
     <w:p>
@@ -4289,7 +4312,7 @@
           <w:sz w:val="28"/>
           <w:szCs w:val="28"/>
         </w:rPr>
-        <w:t xml:space="preserve">Ésaïe 40.31 Ceux qui se confient en l’Éternel renouvellent leur force. Ils prennent le vol comme les aigles ; ils courent, et ne se lassent point, ils marchent, et ne se fatiguent point.</w:t>
+        <w:t xml:space="preserve">Ésaïe 40.31 Mais ceux qui comptent sur l’Eternel renouvellent leur force. Ils prennent leur envol comme les aigles. Ils courent sans s’épuiser, ils marchent sans se fatiguer.</w:t>
       </w:r>
     </w:p>
     <w:p>
@@ -4443,7 +4466,7 @@
           <w:sz w:val="28"/>
           <w:szCs w:val="28"/>
         </w:rPr>
-        <w:t xml:space="preserve">1 Thessaloniciens 5.18 Rendez grâces pour toutes choses, car c'est la volonté de DIEU par JESUS-CHRIST.</w:t>
+        <w:t xml:space="preserve">1 Thessaloniciens 5.18 - Exprimez votre reconnaissance en toute circonstance, car c’est la volonté de Dieu pour vous en Jésus-Christ.</w:t>
       </w:r>
     </w:p>
     <w:p>
@@ -4530,7 +4553,7 @@
           <w:sz w:val="28"/>
           <w:szCs w:val="28"/>
         </w:rPr>
-        <w:t xml:space="preserve">Ézéchiel 22.30 - Je cherche parmi eux un homme qui élève un mur, qui se tienne à la brèche devant moi en faveur du pays, afin que Je ne le détruise pas.</w:t>
+        <w:t xml:space="preserve">Ézéchiel 22.30 - Je cherche parmi eux quelqu’un qui construise un mur, qui se tienne à la brèche devant moi en faveur du pays, pour que je ne le détruise pas.</w:t>
       </w:r>
     </w:p>
     <w:p>
@@ -4644,32 +4667,32 @@
           <w:sz w:val="28"/>
           <w:szCs w:val="28"/>
         </w:rPr>
-        <w:t xml:space="preserve">Lévitique 6.13 – Le feu brûlera continuellement sur l'autel, il ne s'éteindra point.</w:t>
-      </w:r>
-    </w:p>
-    <w:p>
-      <w:pPr>
-        <w:pStyle w:val="Corpsdetexte"/>
-        <w:spacing w:before="90"/>
-        <w:ind w:left="145"/>
-        <w:jc w:val="both"/>
-        <w:rPr>
-          <w:rFonts w:ascii="Calibri" w:hAnsi="Calibri" w:cs="Calibri"/>
-          <w:iCs/>
-          <w:color w:val="548DD4" w:themeColor="text2" w:themeTint="99"/>
-          <w:sz w:val="28"/>
-          <w:szCs w:val="28"/>
-        </w:rPr>
-      </w:pPr>
-      <w:r>
-        <w:rPr>
-          <w:rFonts w:ascii="Calibri" w:hAnsi="Calibri" w:cs="Calibri"/>
-          <w:iCs/>
-          <w:color w:val="548DD4" w:themeColor="text2" w:themeTint="99"/>
-          <w:sz w:val="28"/>
-          <w:szCs w:val="28"/>
-        </w:rPr>
-        <w:t xml:space="preserve">Psaumes 86.6 – Éternel, prête l'oreille à ma prière, Sois attentif à la voix de mes supplications !</w:t>
+        <w:t xml:space="preserve">Lévitique 6.6 - Le feu brûlera constamment sur l’autel, il ne s’éteindra pas.</w:t>
+      </w:r>
+    </w:p>
+    <w:p>
+      <w:pPr>
+        <w:pStyle w:val="Corpsdetexte"/>
+        <w:spacing w:before="90"/>
+        <w:ind w:left="145"/>
+        <w:jc w:val="both"/>
+        <w:rPr>
+          <w:rFonts w:ascii="Calibri" w:hAnsi="Calibri" w:cs="Calibri"/>
+          <w:iCs/>
+          <w:color w:val="548DD4" w:themeColor="text2" w:themeTint="99"/>
+          <w:sz w:val="28"/>
+          <w:szCs w:val="28"/>
+        </w:rPr>
+      </w:pPr>
+      <w:r>
+        <w:rPr>
+          <w:rFonts w:ascii="Calibri" w:hAnsi="Calibri" w:cs="Calibri"/>
+          <w:iCs/>
+          <w:color w:val="548DD4" w:themeColor="text2" w:themeTint="99"/>
+          <w:sz w:val="28"/>
+          <w:szCs w:val="28"/>
+        </w:rPr>
+        <w:t xml:space="preserve">Psaume 86.6 - Eternel, prête l’oreille à ma prière, sois attentif à mes supplications !</w:t>
       </w:r>
     </w:p>
     <w:p>
@@ -4756,7 +4779,7 @@
           <w:sz w:val="28"/>
           <w:szCs w:val="28"/>
         </w:rPr>
-        <w:t xml:space="preserve">Ésaïe 40.31 Ceux qui se confient en l’Éternel renouvellent leur force. Ils prennent le vol comme les aigles ; ils courent, et ne se lassent point, ils marchent, et ne se fatiguent point.</w:t>
+        <w:t xml:space="preserve">Ésaïe 40.31 Mais ceux qui comptent sur l’Eternel renouvellent leur force. Ils prennent leur envol comme les aigles. Ils courent sans s’épuiser, ils marchent sans se fatiguer.</w:t>
       </w:r>
     </w:p>
     <w:p>
@@ -4929,7 +4952,7 @@
           <w:sz w:val="28"/>
           <w:szCs w:val="28"/>
         </w:rPr>
-        <w:t xml:space="preserve">1 Corinthiens 1.4 - Je rends à mon DIEU de continuelles actions de grâces à votre sujet, pour la grâce de DIEU qui vous a été accordée en JESUS CHRIST.</w:t>
+        <w:t xml:space="preserve">1 Corinthiens 1.4 - Je dis constamment à mon Dieu toute ma reconnaissance à votre sujet pour la grâce de Dieu qui vous a été accordée en Jésus-Christ.</w:t>
       </w:r>
     </w:p>
     <w:p>
@@ -5016,7 +5039,7 @@
           <w:sz w:val="28"/>
           <w:szCs w:val="28"/>
         </w:rPr>
-        <w:t xml:space="preserve">Deutéronome 12.6 - Et vous apporterez là vos holocaustes, et vos sacrifices, et vos dîmes, et l'offrande élevée de vos mains, et vos vœux, et vos offrandes volontaires.</w:t>
+        <w:t xml:space="preserve">Deutéronome 12.6 - C’est là que vous présenterez vos holocaustes, vos sacrifices, vos dîmes, vos prélèvements, vos offrandes faites en accomplissement d’un vœu et vos offrandes volontaires.</w:t>
       </w:r>
     </w:p>
     <w:p>
@@ -5103,7 +5126,7 @@
           <w:sz w:val="28"/>
           <w:szCs w:val="28"/>
         </w:rPr>
-        <w:t xml:space="preserve">Genèse 26.12-13 - Isaac sema dans ce pays, et il recueillit cette année le centuple ; car l'Eternel le bénit. Cet homme devint riche, et il alla s'enrichissant de plus en plus, jusqu'à ce qu'il devint fort riche.</w:t>
+        <w:t xml:space="preserve">Genèse 26.12-13 - Isaac fit des semailles dans le pays et il récolta le centuple cette année-là, car l’Eternel le bénit. Cet homme devint riche. Il s’enrichit de plus en plus, jusqu’à devenir très riche.</w:t>
       </w:r>
     </w:p>
     <w:p>
@@ -5190,7 +5213,7 @@
           <w:sz w:val="28"/>
           <w:szCs w:val="28"/>
         </w:rPr>
-        <w:t xml:space="preserve">Ésaïe 40.31 Ceux qui se confient en l’Éternel renouvellent leur force. Ils prennent le vol comme les aigles ; ils courent, et ne se lassent point, ils marchent, et ne se fatiguent point.</w:t>
+        <w:t xml:space="preserve">Ésaïe 40.31 Mais ceux qui comptent sur l’Eternel renouvellent leur force. Ils prennent leur envol comme les aigles. Ils courent sans s’épuiser, ils marchent sans se fatiguer.</w:t>
       </w:r>
     </w:p>
     <w:p>
@@ -5344,7 +5367,7 @@
           <w:sz w:val="28"/>
           <w:szCs w:val="28"/>
         </w:rPr>
-        <w:t xml:space="preserve">Ésaïe 58.10 Si tu donnes ta propre subsistance à celui qui a faim, si tu rassasies l'âme indigente, ta lumière se lèvera sur l'obscurité.</w:t>
+        <w:t xml:space="preserve">Ésaïe 58.10 - Si tu partages tes propres ressources avec celui qui a faim, si tu réponds aux besoins de l’opprimé, ta lumière surgira au milieu des ténèbres.</w:t>
       </w:r>
     </w:p>
     <w:p>
@@ -5458,7 +5481,7 @@
           <w:sz w:val="28"/>
           <w:szCs w:val="28"/>
         </w:rPr>
-        <w:t xml:space="preserve">Luc 6.12-13 En ce temps-là, JESUS se rendit sur la montagne pour prier, et Il passa toute la nuit à prier DIEU. Quand le jour parut, Il appela ses disciples, et Il en choisit douze.</w:t>
+        <w:t xml:space="preserve">Luc 6.12-13 - A cette époque-là, Jésus se retira sur la montagne pour prier ; il passa toute la nuit à prier Dieu. Quand le jour fut levé, il appela ses disciples et il en choisit parmi eux douze auxquels il donna le nom d’apôtres.</w:t>
       </w:r>
     </w:p>
     <w:p>
@@ -5572,32 +5595,7 @@
           <w:sz w:val="28"/>
           <w:szCs w:val="28"/>
         </w:rPr>
-        <w:t xml:space="preserve">Actes 2.47 Et le Seigneur ajoutait chaque jour à l'Église ceux qui étaient sauvés.</w:t>
-      </w:r>
-    </w:p>
-    <w:p>
-      <w:pPr>
-        <w:pStyle w:val="Corpsdetexte"/>
-        <w:spacing w:before="90"/>
-        <w:ind w:left="145"/>
-        <w:jc w:val="both"/>
-        <w:rPr>
-          <w:rFonts w:ascii="Calibri" w:hAnsi="Calibri" w:cs="Calibri"/>
-          <w:iCs/>
-          <w:color w:val="548DD4" w:themeColor="text2" w:themeTint="99"/>
-          <w:sz w:val="28"/>
-          <w:szCs w:val="28"/>
-        </w:rPr>
-      </w:pPr>
-      <w:r>
-        <w:rPr>
-          <w:rFonts w:ascii="Calibri" w:hAnsi="Calibri" w:cs="Calibri"/>
-          <w:iCs/>
-          <w:color w:val="548DD4" w:themeColor="text2" w:themeTint="99"/>
-          <w:sz w:val="28"/>
-          <w:szCs w:val="28"/>
-        </w:rPr>
-        <w:t xml:space="preserve">Ésaïe 60.22 Le plus petit deviendra un millier, et le moindre une nation puissante. Moi, l'Éternel, je hâterai ces choses en leur temps.</w:t>
+        <w:t xml:space="preserve">Actes 2.47 - Ils louaient Dieu et avaient la faveur de tout le peuple. Le Seigneur ajoutait chaque jour à l’Eglise ceux qui étaient sauvés.</w:t>
       </w:r>
     </w:p>
     <w:p>
@@ -5684,7 +5682,7 @@
           <w:sz w:val="28"/>
           <w:szCs w:val="28"/>
         </w:rPr>
-        <w:t xml:space="preserve">Ésaïe 40.31 Ceux qui se confient en l’Éternel renouvellent leur force. Ils prennent le vol comme les aigles ; ils courent, et ne se lassent point, ils marchent, et ne se fatiguent point.</w:t>
+        <w:t xml:space="preserve">Ésaïe 40.31 Mais ceux qui comptent sur l’Eternel renouvellent leur force. Ils prennent leur envol comme les aigles. Ils courent sans s’épuiser, ils marchent sans se fatiguer.</w:t>
       </w:r>
     </w:p>
     <w:p>
@@ -5811,7 +5809,7 @@
           <w:sz w:val="28"/>
           <w:szCs w:val="28"/>
         </w:rPr>
-        <w:t xml:space="preserve">Jean 15.5 Je suis le cep, vous êtes les sarments. Celui qui demeure en moi et en qui je demeure porte beaucoup de fruit, car sans moi vous ne pouvez rien faire.</w:t>
+        <w:t xml:space="preserve">Jean 15.5 - Je suis le cep, vous êtes les sarments. Celui qui demeure en moi et en qui je demeure porte beaucoup de fruit, car sans moi vous ne pouvez rien faire.</w:t>
       </w:r>
     </w:p>
     <w:p>
@@ -5898,7 +5896,7 @@
           <w:sz w:val="28"/>
           <w:szCs w:val="28"/>
         </w:rPr>
-        <w:t xml:space="preserve">2 Pierre 1.5-8 Faites tous vos efforts pour joindre à votre foi la vertu... la maîtrise de soi... la persévérance.</w:t>
+        <w:t xml:space="preserve">2 Pierre 1.5-6 - Faites tous vos efforts afin d’ajouter à votre foi la qualité morale, à la qualité morale la connaissance, à la connaissance la maîtrise de soi, à la maîtrise de soi la persévérance.</w:t>
       </w:r>
     </w:p>
     <w:p>
@@ -6012,32 +6010,32 @@
           <w:sz w:val="28"/>
           <w:szCs w:val="28"/>
         </w:rPr>
-        <w:t xml:space="preserve">Philippiens 2.15 Afin que vous soyez irréprochables et purs, des enfants de DIEU... parmi lesquels vous brillez comme des flambeaux dans le monde.</w:t>
-      </w:r>
-    </w:p>
-    <w:p>
-      <w:pPr>
-        <w:pStyle w:val="Corpsdetexte"/>
-        <w:spacing w:before="90"/>
-        <w:ind w:left="145"/>
-        <w:jc w:val="both"/>
-        <w:rPr>
-          <w:rFonts w:ascii="Calibri" w:hAnsi="Calibri" w:cs="Calibri"/>
-          <w:iCs/>
-          <w:color w:val="548DD4" w:themeColor="text2" w:themeTint="99"/>
-          <w:sz w:val="28"/>
-          <w:szCs w:val="28"/>
-        </w:rPr>
-      </w:pPr>
-      <w:r>
-        <w:rPr>
-          <w:rFonts w:ascii="Calibri" w:hAnsi="Calibri" w:cs="Calibri"/>
-          <w:iCs/>
-          <w:color w:val="548DD4" w:themeColor="text2" w:themeTint="99"/>
-          <w:sz w:val="28"/>
-          <w:szCs w:val="28"/>
-        </w:rPr>
-        <w:t xml:space="preserve">Éphésiens 4.32 Soyez bons les uns envers les autres, compatissants, vous pardonnant réciproquement, comme DIEU vous a pardonné en CHRIST.</w:t>
+        <w:t xml:space="preserve">Philippiens 2.15 - Afin d’être irréprochables et purs, des enfants de Dieu sans défaut au milieu d’une génération perverse et corrompue. C’est comme des flambeaux dans le monde que vous brillez parmi eux.</w:t>
+      </w:r>
+    </w:p>
+    <w:p>
+      <w:pPr>
+        <w:pStyle w:val="Corpsdetexte"/>
+        <w:spacing w:before="90"/>
+        <w:ind w:left="145"/>
+        <w:jc w:val="both"/>
+        <w:rPr>
+          <w:rFonts w:ascii="Calibri" w:hAnsi="Calibri" w:cs="Calibri"/>
+          <w:iCs/>
+          <w:color w:val="548DD4" w:themeColor="text2" w:themeTint="99"/>
+          <w:sz w:val="28"/>
+          <w:szCs w:val="28"/>
+        </w:rPr>
+      </w:pPr>
+      <w:r>
+        <w:rPr>
+          <w:rFonts w:ascii="Calibri" w:hAnsi="Calibri" w:cs="Calibri"/>
+          <w:iCs/>
+          <w:color w:val="548DD4" w:themeColor="text2" w:themeTint="99"/>
+          <w:sz w:val="28"/>
+          <w:szCs w:val="28"/>
+        </w:rPr>
+        <w:t xml:space="preserve">Éphésiens 4.32 - Soyez bons et pleins de compassion les uns envers les autres ; pardonnez-vous réciproquement comme Dieu nous a pardonné en Christ.</w:t>
       </w:r>
     </w:p>
     <w:p>
@@ -6124,7 +6122,7 @@
           <w:sz w:val="28"/>
           <w:szCs w:val="28"/>
         </w:rPr>
-        <w:t xml:space="preserve">Ésaïe 40.31 Ceux qui se confient en l’Éternel renouvellent leur force. Ils prennent le vol comme les aigles ; ils courent, et ne se lassent point, ils marchent, et ne se fatiguent point.</w:t>
+        <w:t xml:space="preserve">Ésaïe 40.31 Mais ceux qui comptent sur l’Eternel renouvellent leur force. Ils prennent leur envol comme les aigles. Ils courent sans s’épuiser, ils marchent sans se fatiguer.</w:t>
       </w:r>
     </w:p>
     <w:p>

</xml_diff>

<commit_message>
Supprime toute formulation de proclamation ou de declaration
Les 7 lignes ouvertes par « Proclamons » ou « Declarons » sont reecrites
dans le registre de la demande (« Prions que... », « Demandons... »),
conformement a la demande de l'utilisateur.

Creneaux touches :
- 18H00-20H00 : les 6 lignes des trois premiers sujets
- 06H00-08H00 : la ligne du sujet « La liberation des ames oppressees »
  (cette formulation etait reprise telle quelle du document du 13 au 18)

Le sens et les versets sont inchanges. Verification : aucune occurrence
de proclamation, declaration ou decret ne subsiste dans le document.

Co-Authored-By: Claude Opus 5 <noreply@anthropic.com>
Claude-Session: https://claude.ai/code/session_013WPa8GGP988ihdHYSaQ9ok
</commit_message>
<xml_diff>
--- a/documents/Sujets de prière semaine du 20 au 25 septembre 2026.docx
+++ b/documents/Sujets de prière semaine du 20 au 25 septembre 2026.docx
@@ -493,34 +493,34 @@
           <w:szCs w:val="28"/>
           <w:lang w:val="fr-BE"/>
         </w:rPr>
-        <w:t xml:space="preserve">Déclarons que l’église ICC Benelux est plantée près d’un cours d’eau et que tout ce que nous entreprenons dans cette saison réussit par la grâce de DIEU.</w:t>
-      </w:r>
-    </w:p>
-    <w:p>
-      <w:pPr>
-        <w:pStyle w:val="Corpsdetexte"/>
-        <w:spacing w:before="90"/>
-        <w:ind w:left="145"/>
-        <w:jc w:val="both"/>
-        <w:rPr>
-          <w:rFonts w:ascii="Calibri" w:hAnsi="Calibri" w:cs="Calibri"/>
-          <w:b w:val="0"/>
-          <w:bCs w:val="0"/>
-          <w:sz w:val="28"/>
-          <w:szCs w:val="28"/>
-          <w:lang w:val="fr-BE"/>
-        </w:rPr>
-      </w:pPr>
-      <w:r>
-        <w:rPr>
-          <w:rFonts w:ascii="Calibri" w:hAnsi="Calibri" w:cs="Calibri"/>
-          <w:b w:val="0"/>
-          <w:bCs w:val="0"/>
-          <w:sz w:val="28"/>
-          <w:szCs w:val="28"/>
-          <w:lang w:val="fr-BE"/>
-        </w:rPr>
-        <w:t xml:space="preserve">Proclamons que notre feuillage ne se flétrit pas ; nos vies, nos familles et nos ministères portent un fruit abondant, visible et durable pour la Gloire de DIEU.</w:t>
+        <w:t xml:space="preserve">Prions que l’église ICC Benelux soit comme un arbre planté près d’un cours d’eau, et que tout ce que nous entreprenons dans cette saison réussisse par la grâce de DIEU.</w:t>
+      </w:r>
+    </w:p>
+    <w:p>
+      <w:pPr>
+        <w:pStyle w:val="Corpsdetexte"/>
+        <w:spacing w:before="90"/>
+        <w:ind w:left="145"/>
+        <w:jc w:val="both"/>
+        <w:rPr>
+          <w:rFonts w:ascii="Calibri" w:hAnsi="Calibri" w:cs="Calibri"/>
+          <w:b w:val="0"/>
+          <w:bCs w:val="0"/>
+          <w:sz w:val="28"/>
+          <w:szCs w:val="28"/>
+          <w:lang w:val="fr-BE"/>
+        </w:rPr>
+      </w:pPr>
+      <w:r>
+        <w:rPr>
+          <w:rFonts w:ascii="Calibri" w:hAnsi="Calibri" w:cs="Calibri"/>
+          <w:b w:val="0"/>
+          <w:bCs w:val="0"/>
+          <w:sz w:val="28"/>
+          <w:szCs w:val="28"/>
+          <w:lang w:val="fr-BE"/>
+        </w:rPr>
+        <w:t xml:space="preserve">Demandons au Père que notre feuillage ne se flétrisse pas, et que nos vies, nos familles et nos ministères portent un fruit abondant, visible et durable pour la Gloire de DIEU.</w:t>
       </w:r>
     </w:p>
     <w:p>
@@ -607,34 +607,34 @@
           <w:szCs w:val="28"/>
           <w:lang w:val="fr-BE"/>
         </w:rPr>
-        <w:t xml:space="preserve">Proclamons que les limites de l’église ICC Benelux sont repoussées. DIEU agrandit l’espace de nos tentes, allonge nos cordages et renforce nos piquets dans tous les territoires où Il nous a établis.</w:t>
-      </w:r>
-    </w:p>
-    <w:p>
-      <w:pPr>
-        <w:pStyle w:val="Corpsdetexte"/>
-        <w:spacing w:before="90"/>
-        <w:ind w:left="145"/>
-        <w:jc w:val="both"/>
-        <w:rPr>
-          <w:rFonts w:ascii="Calibri" w:hAnsi="Calibri" w:cs="Calibri"/>
-          <w:b w:val="0"/>
-          <w:bCs w:val="0"/>
-          <w:sz w:val="28"/>
-          <w:szCs w:val="28"/>
-          <w:lang w:val="fr-BE"/>
-        </w:rPr>
-      </w:pPr>
-      <w:r>
-        <w:rPr>
-          <w:rFonts w:ascii="Calibri" w:hAnsi="Calibri" w:cs="Calibri"/>
-          <w:b w:val="0"/>
-          <w:bCs w:val="0"/>
-          <w:sz w:val="28"/>
-          <w:szCs w:val="28"/>
-          <w:lang w:val="fr-BE"/>
-        </w:rPr>
-        <w:t xml:space="preserve">Déclarons que l’étroitesse, la stagnation et la limitation sont brisées au Nom de JESUS CHRIST ; nous entrons dans la dimension du débordement et de l’abondance.</w:t>
+        <w:t xml:space="preserve">Prions que DIEU repousse les limites de l’église ICC Benelux, qu’Il agrandisse l’espace de nos tentes, allonge nos cordages et renforce nos piquets dans tous les territoires où Il nous a établis.</w:t>
+      </w:r>
+    </w:p>
+    <w:p>
+      <w:pPr>
+        <w:pStyle w:val="Corpsdetexte"/>
+        <w:spacing w:before="90"/>
+        <w:ind w:left="145"/>
+        <w:jc w:val="both"/>
+        <w:rPr>
+          <w:rFonts w:ascii="Calibri" w:hAnsi="Calibri" w:cs="Calibri"/>
+          <w:b w:val="0"/>
+          <w:bCs w:val="0"/>
+          <w:sz w:val="28"/>
+          <w:szCs w:val="28"/>
+          <w:lang w:val="fr-BE"/>
+        </w:rPr>
+      </w:pPr>
+      <w:r>
+        <w:rPr>
+          <w:rFonts w:ascii="Calibri" w:hAnsi="Calibri" w:cs="Calibri"/>
+          <w:b w:val="0"/>
+          <w:bCs w:val="0"/>
+          <w:sz w:val="28"/>
+          <w:szCs w:val="28"/>
+          <w:lang w:val="fr-BE"/>
+        </w:rPr>
+        <w:t xml:space="preserve">Demandons au SEIGNEUR de briser l’étroitesse, la stagnation et la limitation au Nom de JESUS CHRIST, et de nous faire entrer dans la dimension du débordement et de l’abondance.</w:t>
       </w:r>
     </w:p>
     <w:p>
@@ -721,34 +721,34 @@
           <w:szCs w:val="28"/>
           <w:lang w:val="fr-BE"/>
         </w:rPr>
-        <w:t xml:space="preserve">Déclarons que nous ne retournons pas en arrière. Ce que DIEU a commencé dans l’église ICC Benelux, Il l’amène à son accomplissement parfait.</w:t>
-      </w:r>
-    </w:p>
-    <w:p>
-      <w:pPr>
-        <w:pStyle w:val="Corpsdetexte"/>
-        <w:spacing w:before="90"/>
-        <w:ind w:left="145"/>
-        <w:jc w:val="both"/>
-        <w:rPr>
-          <w:rFonts w:ascii="Calibri" w:hAnsi="Calibri" w:cs="Calibri"/>
-          <w:b w:val="0"/>
-          <w:bCs w:val="0"/>
-          <w:sz w:val="28"/>
-          <w:szCs w:val="28"/>
-          <w:lang w:val="fr-BE"/>
-        </w:rPr>
-      </w:pPr>
-      <w:r>
-        <w:rPr>
-          <w:rFonts w:ascii="Calibri" w:hAnsi="Calibri" w:cs="Calibri"/>
-          <w:b w:val="0"/>
-          <w:bCs w:val="0"/>
-          <w:sz w:val="28"/>
-          <w:szCs w:val="28"/>
-          <w:lang w:val="fr-BE"/>
-        </w:rPr>
-        <w:t xml:space="preserve">Proclamons que la Gloire de ce dernier temple est plus grande que celle du premier, et que DIEU donne Sa paix dans cette maison.</w:t>
+        <w:t xml:space="preserve">Prions que ce que DIEU a commencé dans l’église ICC Benelux, Il l’amène à son accomplissement parfait, et que nous ne retournions pas en arrière.</w:t>
+      </w:r>
+    </w:p>
+    <w:p>
+      <w:pPr>
+        <w:pStyle w:val="Corpsdetexte"/>
+        <w:spacing w:before="90"/>
+        <w:ind w:left="145"/>
+        <w:jc w:val="both"/>
+        <w:rPr>
+          <w:rFonts w:ascii="Calibri" w:hAnsi="Calibri" w:cs="Calibri"/>
+          <w:b w:val="0"/>
+          <w:bCs w:val="0"/>
+          <w:sz w:val="28"/>
+          <w:szCs w:val="28"/>
+          <w:lang w:val="fr-BE"/>
+        </w:rPr>
+      </w:pPr>
+      <w:r>
+        <w:rPr>
+          <w:rFonts w:ascii="Calibri" w:hAnsi="Calibri" w:cs="Calibri"/>
+          <w:b w:val="0"/>
+          <w:bCs w:val="0"/>
+          <w:sz w:val="28"/>
+          <w:szCs w:val="28"/>
+          <w:lang w:val="fr-BE"/>
+        </w:rPr>
+        <w:t xml:space="preserve">Demandons que la Gloire de ce dernier temple soit plus grande que celle du premier, et que DIEU donne Sa paix dans cette maison.</w:t>
       </w:r>
     </w:p>
     <w:p>
@@ -3731,7 +3731,7 @@
           <w:szCs w:val="28"/>
           <w:lang w:val="fr-BE"/>
         </w:rPr>
-        <w:t xml:space="preserve">Proclamons leur délivrance totale et définitive de tous assujettissements, liens, chaînes, captivités et emprises de l’ennemi sur leurs vies.</w:t>
+        <w:t xml:space="preserve">Prions pour leur délivrance totale et définitive de tous assujettissements, liens, chaînes, captivités et emprises de l’ennemi sur leurs vies.</w:t>
       </w:r>
     </w:p>
     <w:p>

</xml_diff>

<commit_message>
Presente la Grande Rentree des STAR comme un rassemblement
La Rentree des STAR est le rassemblement de tous les serviteurs de la
maison. Les deux sujets qui la concernent sont reformules en consequence.

- 22H00-00H00 : priere pour le rassemblement lui-meme, que DIEU y convoque
  chaque serviteur et qu'aucun ne manque a l'appel.
- 08H00-10H00 : priere pour la mobilisation, l'organisation et le
  deroulement du rassemblement, et pour ce que chaque serviteur en remporte.

Titres, versets et structure inchanges.

Co-Authored-By: Claude Opus 5 <noreply@anthropic.com>
Claude-Session: https://claude.ai/code/session_013WPa8GGP988ihdHYSaQ9ok
</commit_message>
<xml_diff>
--- a/documents/Sujets de prière semaine du 20 au 25 septembre 2026.docx
+++ b/documents/Sujets de prière semaine du 20 au 25 septembre 2026.docx
@@ -1578,7 +1578,7 @@
           <w:szCs w:val="28"/>
           <w:lang w:val="fr-BE"/>
         </w:rPr>
-        <w:t xml:space="preserve">Prions que chaque STAR (Serviteur Travaillant Activement pour le Royaume) reprenne son service avec un cœur renouvelé, une consécration profonde et un zèle embrasé pour la maison de DIEU.</w:t>
+        <w:t xml:space="preserve">Prions pour le rassemblement de tous les STAR (Serviteurs Travaillant Activement pour le Royaume) : que DIEU y convoque Lui-même chaque serviteur, qu’aucun ne manque à l’appel et que tous s’y présentent avec un cœur renouvelé et un zèle embrasé pour la maison de DIEU.</w:t>
       </w:r>
     </w:p>
     <w:p>
@@ -4059,34 +4059,34 @@
           <w:szCs w:val="28"/>
           <w:lang w:val="fr-BE"/>
         </w:rPr>
-        <w:t xml:space="preserve">Prions pour la Grande Rentrée des STAR (Serviteurs Travaillant Activement pour le Royaume). Que le SAINT ESPRIT soit honoré, révéré et célébré par tous les STAR.</w:t>
-      </w:r>
-    </w:p>
-    <w:p>
-      <w:pPr>
-        <w:pStyle w:val="Corpsdetexte"/>
-        <w:spacing w:before="90"/>
-        <w:ind w:left="145"/>
-        <w:jc w:val="both"/>
-        <w:rPr>
-          <w:rFonts w:ascii="Calibri" w:hAnsi="Calibri" w:cs="Calibri"/>
-          <w:b w:val="0"/>
-          <w:bCs w:val="0"/>
-          <w:sz w:val="28"/>
-          <w:szCs w:val="28"/>
-          <w:lang w:val="fr-BE"/>
-        </w:rPr>
-      </w:pPr>
-      <w:r>
-        <w:rPr>
-          <w:rFonts w:ascii="Calibri" w:hAnsi="Calibri" w:cs="Calibri"/>
-          <w:b w:val="0"/>
-          <w:bCs w:val="0"/>
-          <w:sz w:val="28"/>
-          <w:szCs w:val="28"/>
-          <w:lang w:val="fr-BE"/>
-        </w:rPr>
-        <w:t xml:space="preserve">Qu'IL puisse inspirer et diriger totalement le déroulement de cet évènement, et que chaque serviteur reprenne son poste de service avec une fraîche onction et une joie débordante.</w:t>
+        <w:t xml:space="preserve">Prions pour la Grande Rentrée des STAR (Serviteurs Travaillant Activement pour le Royaume), le grand rassemblement de tous les serviteurs de la maison. Que le SAINT ESPRIT soit honoré, révéré et célébré par tous les STAR durant ce rassemblement.</w:t>
+      </w:r>
+    </w:p>
+    <w:p>
+      <w:pPr>
+        <w:pStyle w:val="Corpsdetexte"/>
+        <w:spacing w:before="90"/>
+        <w:ind w:left="145"/>
+        <w:jc w:val="both"/>
+        <w:rPr>
+          <w:rFonts w:ascii="Calibri" w:hAnsi="Calibri" w:cs="Calibri"/>
+          <w:b w:val="0"/>
+          <w:bCs w:val="0"/>
+          <w:sz w:val="28"/>
+          <w:szCs w:val="28"/>
+          <w:lang w:val="fr-BE"/>
+        </w:rPr>
+      </w:pPr>
+      <w:r>
+        <w:rPr>
+          <w:rFonts w:ascii="Calibri" w:hAnsi="Calibri" w:cs="Calibri"/>
+          <w:b w:val="0"/>
+          <w:bCs w:val="0"/>
+          <w:sz w:val="28"/>
+          <w:szCs w:val="28"/>
+          <w:lang w:val="fr-BE"/>
+        </w:rPr>
+        <w:t xml:space="preserve">Qu'IL inspire et dirige totalement la mobilisation, l’organisation et le déroulement de ce rassemblement. Que chaque serviteur qui s’y rendra en reparte avec une fraîche onction, des directives claires et une joie débordante pour reprendre son poste de service.</w:t>
       </w:r>
     </w:p>
     <w:p>

</xml_diff>

<commit_message>
Retablit les trois consignes qui n'avaient pas ete respectees
1. Consignes identiques : suppression de la note « NB : tous les versets
   sont cites en Segond 21 » que j'avais ajoutee a la page des consignes.
   Les 11 consignes sont de nouveau strictement celles de l'original.

2. Creneau 00H00-02H00 fige : le bloc est repris mot pour mot du document
   du 13 au 18 septembre (titres, textes, versets Louis Segond, y compris
   « Nouveau locaux » et « maturite spirituelles »).

3. Bloc du Pasteur Christian fige : le verset Esaie 40.31 reprend sa
   formulation Louis Segond d'origine dans les 12 creneaux.

Le Segond 21 reste applique aux versets des dix creneaux non figes.

Co-Authored-By: Claude Opus 5 <noreply@anthropic.com>
Claude-Session: https://claude.ai/code/session_013WPa8GGP988ihdHYSaQ9ok
</commit_message>
<xml_diff>
--- a/documents/Sujets de prière semaine du 20 au 25 septembre 2026.docx
+++ b/documents/Sujets de prière semaine du 20 au 25 septembre 2026.docx
@@ -325,27 +325,6 @@
           <w:sz w:val="28"/>
           <w:szCs w:val="28"/>
         </w:rPr>
-      </w:pPr>
-      <w:r>
-        <w:rPr>
-          <w:rFonts w:ascii="Calibri" w:hAnsi="Calibri" w:cs="Calibri"/>
-          <w:sz w:val="28"/>
-          <w:szCs w:val="28"/>
-        </w:rPr>
-        <w:t xml:space="preserve">Tout ce qui se passe dans le groupe reste dans le groupe. Vous ne devez pas en parler avec des personnes qui ne sont pas reprises dans le groupe.</w:t>
-      </w:r>
-    </w:p>
-    <w:p>
-      <w:pPr>
-        <w:spacing w:before="300"/>
-        <w:ind w:left="165"/>
-        <w:rPr>
-          <w:rFonts w:ascii="Calibri" w:hAnsi="Calibri" w:cs="Calibri"/>
-          <w:b/>
-          <w:i/>
-          <w:sz w:val="28"/>
-          <w:szCs w:val="28"/>
-        </w:rPr>
         <w:sectPr>
           <w:pgSz w:w="11910" w:h="16840"/>
           <w:pgMar w:top="1400" w:right="1275" w:bottom="280" w:left="1275" w:header="720" w:footer="720" w:gutter="0"/>
@@ -355,12 +334,10 @@
       <w:r>
         <w:rPr>
           <w:rFonts w:ascii="Calibri" w:hAnsi="Calibri" w:cs="Calibri"/>
-          <w:b/>
-          <w:i/>
-          <w:sz w:val="28"/>
-          <w:szCs w:val="28"/>
-        </w:rPr>
-        <w:t xml:space="preserve">NB : tous les versets de ce document sont cités dans la version Segond 21 (S21).</w:t>
+          <w:sz w:val="28"/>
+          <w:szCs w:val="28"/>
+        </w:rPr>
+        <w:t xml:space="preserve">Tout ce qui se passe dans le groupe reste dans le groupe. Vous ne devez pas en parler avec des personnes qui ne sont pas reprises dans le groupe.</w:t>
       </w:r>
     </w:p>
     <w:p>
@@ -860,7 +837,7 @@
           <w:sz w:val="28"/>
           <w:szCs w:val="28"/>
         </w:rPr>
-        <w:t xml:space="preserve">Ésaïe 40.31 Mais ceux qui comptent sur l’Eternel renouvellent leur force. Ils prennent leur envol comme les aigles. Ils courent sans s’épuiser, ils marchent sans se fatiguer.</w:t>
+        <w:t xml:space="preserve">Ésaïe 40.31 Ceux qui se confient en l’Éternel renouvellent leur force. Ils prennent le vol comme les aigles ; ils courent, et ne se lassent point, ils marchent, et ne se fatiguent point.</w:t>
       </w:r>
     </w:p>
     <w:p>
@@ -1275,7 +1252,7 @@
           <w:sz w:val="28"/>
           <w:szCs w:val="28"/>
         </w:rPr>
-        <w:t xml:space="preserve">Ésaïe 40.31 Mais ceux qui comptent sur l’Eternel renouvellent leur force. Ils prennent leur envol comme les aigles. Ils courent sans s’épuiser, ils marchent sans se fatiguer.</w:t>
+        <w:t xml:space="preserve">Ésaïe 40.31 Ceux qui se confient en l’Éternel renouvellent leur force. Ils prennent le vol comme les aigles ; ils courent, et ne se lassent point, ils marchent, et ne se fatiguent point.</w:t>
       </w:r>
     </w:p>
     <w:p>
@@ -1690,7 +1667,7 @@
           <w:sz w:val="28"/>
           <w:szCs w:val="28"/>
         </w:rPr>
-        <w:t xml:space="preserve">Ésaïe 40.31 Mais ceux qui comptent sur l’Eternel renouvellent leur force. Ils prennent leur envol comme les aigles. Ils courent sans s’épuiser, ils marchent sans se fatiguer.</w:t>
+        <w:t xml:space="preserve">Ésaïe 40.31 Ceux qui se confient en l’Éternel renouvellent leur force. Ils prennent le vol comme les aigles ; ils courent, et ne se lassent point, ils marchent, et ne se fatiguent point.</w:t>
       </w:r>
     </w:p>
     <w:p>
@@ -1811,7 +1788,7 @@
           <w:sz w:val="28"/>
           <w:szCs w:val="28"/>
         </w:rPr>
-        <w:t xml:space="preserve">1. Actions de Grâce pour ICC Bruxelles</w:t>
+        <w:t xml:space="preserve">1.Actions de Grâce pour ICC Bruxelles</w:t>
       </w:r>
     </w:p>
     <w:p>
@@ -1863,42 +1840,42 @@
           <w:sz w:val="28"/>
           <w:szCs w:val="28"/>
         </w:rPr>
-        <w:t xml:space="preserve">Éphésiens 5.20 - Remerciez constamment Dieu le Père pour tout, au nom de notre Seigneur Jésus-Christ.</w:t>
-      </w:r>
-    </w:p>
-    <w:p>
-      <w:pPr>
-        <w:pStyle w:val="Corpsdetexte"/>
-        <w:spacing w:before="90"/>
-        <w:ind w:left="145"/>
-        <w:jc w:val="both"/>
-        <w:rPr>
-          <w:rFonts w:ascii="Calibri" w:hAnsi="Calibri" w:cs="Calibri"/>
-          <w:b w:val="0"/>
-          <w:bCs w:val="0"/>
-          <w:sz w:val="28"/>
-          <w:szCs w:val="28"/>
-        </w:rPr>
-      </w:pPr>
-    </w:p>
-    <w:p>
-      <w:pPr>
-        <w:ind w:left="145"/>
-        <w:rPr>
-          <w:rFonts w:ascii="Calibri" w:hAnsi="Calibri" w:cs="Calibri"/>
-          <w:b/>
-          <w:sz w:val="28"/>
-          <w:szCs w:val="28"/>
-        </w:rPr>
-      </w:pPr>
-      <w:r>
-        <w:rPr>
-          <w:rFonts w:ascii="Calibri" w:hAnsi="Calibri" w:cs="Calibri"/>
-          <w:b/>
-          <w:sz w:val="28"/>
-          <w:szCs w:val="28"/>
-        </w:rPr>
-        <w:t xml:space="preserve">2. Recommander les cultes de ICC Bruxelles</w:t>
+        <w:t xml:space="preserve">Éphésiens 5.20 Rendez continuellement grâce pour toutes choses à DIEU le Père, au Nom de Notre Seigneur JESUS-CHRIST.</w:t>
+      </w:r>
+    </w:p>
+    <w:p>
+      <w:pPr>
+        <w:pStyle w:val="Corpsdetexte"/>
+        <w:spacing w:before="90"/>
+        <w:ind w:left="145"/>
+        <w:jc w:val="both"/>
+        <w:rPr>
+          <w:rFonts w:ascii="Calibri" w:hAnsi="Calibri" w:cs="Calibri"/>
+          <w:b w:val="0"/>
+          <w:bCs w:val="0"/>
+          <w:sz w:val="28"/>
+          <w:szCs w:val="28"/>
+        </w:rPr>
+      </w:pPr>
+    </w:p>
+    <w:p>
+      <w:pPr>
+        <w:ind w:left="145"/>
+        <w:rPr>
+          <w:rFonts w:ascii="Calibri" w:hAnsi="Calibri" w:cs="Calibri"/>
+          <w:b/>
+          <w:sz w:val="28"/>
+          <w:szCs w:val="28"/>
+        </w:rPr>
+      </w:pPr>
+      <w:r>
+        <w:rPr>
+          <w:rFonts w:ascii="Calibri" w:hAnsi="Calibri" w:cs="Calibri"/>
+          <w:b/>
+          <w:sz w:val="28"/>
+          <w:szCs w:val="28"/>
+        </w:rPr>
+        <w:t xml:space="preserve">2.Recommander les cultes de ICC Bruxelles</w:t>
       </w:r>
     </w:p>
     <w:p>
@@ -1950,42 +1927,42 @@
           <w:sz w:val="28"/>
           <w:szCs w:val="28"/>
         </w:rPr>
-        <w:t xml:space="preserve">Jacques 1.22 - Mettez en pratique la parole et ne vous contentez pas de l’écouter en vous trompant vous-mêmes par de faux raisonnements.</w:t>
-      </w:r>
-    </w:p>
-    <w:p>
-      <w:pPr>
-        <w:pStyle w:val="Corpsdetexte"/>
-        <w:spacing w:before="90"/>
-        <w:ind w:left="145"/>
-        <w:jc w:val="both"/>
-        <w:rPr>
-          <w:rFonts w:ascii="Calibri" w:hAnsi="Calibri" w:cs="Calibri"/>
-          <w:b w:val="0"/>
-          <w:bCs w:val="0"/>
-          <w:sz w:val="28"/>
-          <w:szCs w:val="28"/>
-        </w:rPr>
-      </w:pPr>
-    </w:p>
-    <w:p>
-      <w:pPr>
-        <w:ind w:left="145"/>
-        <w:rPr>
-          <w:rFonts w:ascii="Calibri" w:hAnsi="Calibri" w:cs="Calibri"/>
-          <w:b/>
-          <w:sz w:val="28"/>
-          <w:szCs w:val="28"/>
-        </w:rPr>
-      </w:pPr>
-      <w:r>
-        <w:rPr>
-          <w:rFonts w:ascii="Calibri" w:hAnsi="Calibri" w:cs="Calibri"/>
-          <w:b/>
-          <w:sz w:val="28"/>
-          <w:szCs w:val="28"/>
-        </w:rPr>
-        <w:t xml:space="preserve">3. Prier pour les projets d’ICC Mons</w:t>
+        <w:t xml:space="preserve">Jacques 1.22 Mettez en pratique la Parole, et ne vous bornez pas à L'écouter, en vous trompant vous-mêmes par de faux raisonnements.</w:t>
+      </w:r>
+    </w:p>
+    <w:p>
+      <w:pPr>
+        <w:pStyle w:val="Corpsdetexte"/>
+        <w:spacing w:before="90"/>
+        <w:ind w:left="145"/>
+        <w:jc w:val="both"/>
+        <w:rPr>
+          <w:rFonts w:ascii="Calibri" w:hAnsi="Calibri" w:cs="Calibri"/>
+          <w:b w:val="0"/>
+          <w:bCs w:val="0"/>
+          <w:sz w:val="28"/>
+          <w:szCs w:val="28"/>
+        </w:rPr>
+      </w:pPr>
+    </w:p>
+    <w:p>
+      <w:pPr>
+        <w:ind w:left="145"/>
+        <w:rPr>
+          <w:rFonts w:ascii="Calibri" w:hAnsi="Calibri" w:cs="Calibri"/>
+          <w:b/>
+          <w:sz w:val="28"/>
+          <w:szCs w:val="28"/>
+        </w:rPr>
+      </w:pPr>
+      <w:r>
+        <w:rPr>
+          <w:rFonts w:ascii="Calibri" w:hAnsi="Calibri" w:cs="Calibri"/>
+          <w:b/>
+          <w:sz w:val="28"/>
+          <w:szCs w:val="28"/>
+        </w:rPr>
+        <w:t xml:space="preserve">3.Prier pour les projets d’ICC Mons</w:t>
       </w:r>
     </w:p>
     <w:p>
@@ -2037,181 +2014,181 @@
           <w:sz w:val="28"/>
           <w:szCs w:val="28"/>
         </w:rPr>
-        <w:t xml:space="preserve">Matthieu 7.7 - Demandez et l’on vous donnera, cherchez et vous trouverez, frappez et l’on vous ouvrira.</w:t>
-      </w:r>
-    </w:p>
-    <w:p>
-      <w:pPr>
-        <w:pStyle w:val="Corpsdetexte"/>
-        <w:spacing w:before="90"/>
-        <w:ind w:left="145"/>
-        <w:jc w:val="both"/>
-        <w:rPr>
-          <w:rFonts w:ascii="Calibri" w:hAnsi="Calibri" w:cs="Calibri"/>
-          <w:b w:val="0"/>
-          <w:bCs w:val="0"/>
-          <w:sz w:val="28"/>
-          <w:szCs w:val="28"/>
-        </w:rPr>
-      </w:pPr>
-    </w:p>
-    <w:p>
-      <w:pPr>
-        <w:ind w:left="145"/>
-        <w:rPr>
-          <w:rFonts w:ascii="Calibri" w:hAnsi="Calibri" w:cs="Calibri"/>
-          <w:b/>
-          <w:sz w:val="28"/>
-          <w:szCs w:val="28"/>
-        </w:rPr>
-      </w:pPr>
-      <w:r>
-        <w:rPr>
-          <w:rFonts w:ascii="Calibri" w:hAnsi="Calibri" w:cs="Calibri"/>
-          <w:b/>
-          <w:sz w:val="28"/>
-          <w:szCs w:val="28"/>
-        </w:rPr>
-        <w:t xml:space="preserve">4. Nouveaux locaux pour ICC Nivelles et maturité spirituelle des fidèles</w:t>
-      </w:r>
-    </w:p>
-    <w:p>
-      <w:pPr>
-        <w:pStyle w:val="Corpsdetexte"/>
-        <w:spacing w:before="90"/>
-        <w:ind w:left="145"/>
-        <w:jc w:val="both"/>
-        <w:rPr>
-          <w:rFonts w:ascii="Calibri" w:hAnsi="Calibri" w:cs="Calibri"/>
-          <w:b w:val="0"/>
-          <w:bCs w:val="0"/>
-          <w:sz w:val="28"/>
-          <w:szCs w:val="28"/>
-          <w:lang w:val="fr-BE"/>
-        </w:rPr>
-      </w:pPr>
-      <w:r>
-        <w:rPr>
-          <w:rFonts w:ascii="Calibri" w:hAnsi="Calibri" w:cs="Calibri"/>
-          <w:b w:val="0"/>
-          <w:bCs w:val="0"/>
-          <w:sz w:val="28"/>
-          <w:szCs w:val="28"/>
-          <w:lang w:val="fr-BE"/>
-        </w:rPr>
-        <w:t xml:space="preserve">Demandons que DIEU accorde la grâce d’obtenir les locaux destinés à ICC Nivelles.</w:t>
-      </w:r>
-    </w:p>
-    <w:p>
-      <w:pPr>
-        <w:pStyle w:val="Corpsdetexte"/>
-        <w:spacing w:before="90"/>
-        <w:ind w:left="145"/>
-        <w:jc w:val="both"/>
-        <w:rPr>
-          <w:rFonts w:ascii="Calibri" w:hAnsi="Calibri" w:cs="Calibri"/>
-          <w:b w:val="0"/>
-          <w:bCs w:val="0"/>
-          <w:sz w:val="28"/>
-          <w:szCs w:val="28"/>
-          <w:lang w:val="fr-BE"/>
-        </w:rPr>
-      </w:pPr>
-      <w:r>
-        <w:rPr>
-          <w:rFonts w:ascii="Calibri" w:hAnsi="Calibri" w:cs="Calibri"/>
-          <w:b w:val="0"/>
-          <w:bCs w:val="0"/>
-          <w:sz w:val="28"/>
-          <w:szCs w:val="28"/>
-          <w:lang w:val="fr-BE"/>
-        </w:rPr>
-        <w:t xml:space="preserve">Prions que DIEU accorde la grâce à tous les membres d’ICC Nivelles d’acquérir de la maturité spirituelle.</w:t>
-      </w:r>
-    </w:p>
-    <w:p>
-      <w:pPr>
-        <w:pStyle w:val="Corpsdetexte"/>
-        <w:spacing w:before="90"/>
-        <w:ind w:left="145"/>
-        <w:jc w:val="both"/>
-        <w:rPr>
-          <w:rFonts w:ascii="Calibri" w:hAnsi="Calibri" w:cs="Calibri"/>
-          <w:iCs/>
-          <w:color w:val="548DD4" w:themeColor="text2" w:themeTint="99"/>
-          <w:sz w:val="28"/>
-          <w:szCs w:val="28"/>
-        </w:rPr>
-      </w:pPr>
-      <w:r>
-        <w:rPr>
-          <w:rFonts w:ascii="Calibri" w:hAnsi="Calibri" w:cs="Calibri"/>
-          <w:iCs/>
-          <w:color w:val="548DD4" w:themeColor="text2" w:themeTint="99"/>
-          <w:sz w:val="28"/>
-          <w:szCs w:val="28"/>
-        </w:rPr>
-        <w:t xml:space="preserve">Psaume 37.5 - Recommande ton sort à l’Eternel, mets ta confiance en lui, et il agira.</w:t>
-      </w:r>
-    </w:p>
-    <w:p>
-      <w:pPr>
-        <w:pStyle w:val="Corpsdetexte"/>
-        <w:spacing w:before="90"/>
-        <w:ind w:left="145"/>
-        <w:jc w:val="both"/>
-        <w:rPr>
-          <w:rFonts w:ascii="Calibri" w:hAnsi="Calibri" w:cs="Calibri"/>
-          <w:iCs/>
-          <w:color w:val="548DD4" w:themeColor="text2" w:themeTint="99"/>
-          <w:sz w:val="28"/>
-          <w:szCs w:val="28"/>
-        </w:rPr>
-      </w:pPr>
-      <w:r>
-        <w:rPr>
-          <w:rFonts w:ascii="Calibri" w:hAnsi="Calibri" w:cs="Calibri"/>
-          <w:iCs/>
-          <w:color w:val="548DD4" w:themeColor="text2" w:themeTint="99"/>
-          <w:sz w:val="28"/>
-          <w:szCs w:val="28"/>
-        </w:rPr>
-        <w:t xml:space="preserve">Galates 4.1 - Voici ce que je veux dire : aussi longtemps que l’héritier est un enfant, il ne diffère en rien d’un esclave, quoiqu’il soit le maître de tout.</w:t>
-      </w:r>
-    </w:p>
-    <w:p>
-      <w:pPr>
-        <w:pStyle w:val="Corpsdetexte"/>
-        <w:spacing w:before="90"/>
-        <w:ind w:left="145"/>
-        <w:jc w:val="both"/>
-        <w:rPr>
-          <w:rFonts w:ascii="Calibri" w:hAnsi="Calibri" w:cs="Calibri"/>
-          <w:b w:val="0"/>
-          <w:bCs w:val="0"/>
-          <w:sz w:val="28"/>
-          <w:szCs w:val="28"/>
-        </w:rPr>
-      </w:pPr>
-    </w:p>
-    <w:p>
-      <w:pPr>
-        <w:ind w:left="145"/>
-        <w:rPr>
-          <w:rFonts w:ascii="Calibri" w:hAnsi="Calibri" w:cs="Calibri"/>
-          <w:b/>
-          <w:sz w:val="28"/>
-          <w:szCs w:val="28"/>
-        </w:rPr>
-      </w:pPr>
-      <w:r>
-        <w:rPr>
-          <w:rFonts w:ascii="Calibri" w:hAnsi="Calibri" w:cs="Calibri"/>
-          <w:b/>
-          <w:sz w:val="28"/>
-          <w:szCs w:val="28"/>
-        </w:rPr>
-        <w:t xml:space="preserve">5. Intercession pour le Pasteur Christian</w:t>
+        <w:t xml:space="preserve">Mathieu 7.7 Demandez, et l'on vous donnera ; cherchez, et vous trouverez ; frappez, et l'on vous ouvrira.</w:t>
+      </w:r>
+    </w:p>
+    <w:p>
+      <w:pPr>
+        <w:pStyle w:val="Corpsdetexte"/>
+        <w:spacing w:before="90"/>
+        <w:ind w:left="145"/>
+        <w:jc w:val="both"/>
+        <w:rPr>
+          <w:rFonts w:ascii="Calibri" w:hAnsi="Calibri" w:cs="Calibri"/>
+          <w:b w:val="0"/>
+          <w:bCs w:val="0"/>
+          <w:sz w:val="28"/>
+          <w:szCs w:val="28"/>
+        </w:rPr>
+      </w:pPr>
+    </w:p>
+    <w:p>
+      <w:pPr>
+        <w:ind w:left="145"/>
+        <w:rPr>
+          <w:rFonts w:ascii="Calibri" w:hAnsi="Calibri" w:cs="Calibri"/>
+          <w:b/>
+          <w:sz w:val="28"/>
+          <w:szCs w:val="28"/>
+        </w:rPr>
+      </w:pPr>
+      <w:r>
+        <w:rPr>
+          <w:rFonts w:ascii="Calibri" w:hAnsi="Calibri" w:cs="Calibri"/>
+          <w:b/>
+          <w:sz w:val="28"/>
+          <w:szCs w:val="28"/>
+        </w:rPr>
+        <w:t xml:space="preserve">4.Nouveau locaux pour ICC Nivelles et maturité spirituelles des fidèles</w:t>
+      </w:r>
+    </w:p>
+    <w:p>
+      <w:pPr>
+        <w:pStyle w:val="Corpsdetexte"/>
+        <w:spacing w:before="90"/>
+        <w:ind w:left="145"/>
+        <w:jc w:val="both"/>
+        <w:rPr>
+          <w:rFonts w:ascii="Calibri" w:hAnsi="Calibri" w:cs="Calibri"/>
+          <w:b w:val="0"/>
+          <w:bCs w:val="0"/>
+          <w:sz w:val="28"/>
+          <w:szCs w:val="28"/>
+          <w:lang w:val="fr-BE"/>
+        </w:rPr>
+      </w:pPr>
+      <w:r>
+        <w:rPr>
+          <w:rFonts w:ascii="Calibri" w:hAnsi="Calibri" w:cs="Calibri"/>
+          <w:b w:val="0"/>
+          <w:bCs w:val="0"/>
+          <w:sz w:val="28"/>
+          <w:szCs w:val="28"/>
+          <w:lang w:val="fr-BE"/>
+        </w:rPr>
+        <w:t xml:space="preserve">Demandons que DIEU accorde la grâce d’obtenir les locaux destinés à ICC Nivelles</w:t>
+      </w:r>
+    </w:p>
+    <w:p>
+      <w:pPr>
+        <w:pStyle w:val="Corpsdetexte"/>
+        <w:spacing w:before="90"/>
+        <w:ind w:left="145"/>
+        <w:jc w:val="both"/>
+        <w:rPr>
+          <w:rFonts w:ascii="Calibri" w:hAnsi="Calibri" w:cs="Calibri"/>
+          <w:iCs/>
+          <w:color w:val="548DD4" w:themeColor="text2" w:themeTint="99"/>
+          <w:sz w:val="28"/>
+          <w:szCs w:val="28"/>
+        </w:rPr>
+      </w:pPr>
+      <w:r>
+        <w:rPr>
+          <w:rFonts w:ascii="Calibri" w:hAnsi="Calibri" w:cs="Calibri"/>
+          <w:iCs/>
+          <w:color w:val="548DD4" w:themeColor="text2" w:themeTint="99"/>
+          <w:sz w:val="28"/>
+          <w:szCs w:val="28"/>
+        </w:rPr>
+        <w:t xml:space="preserve">Psaume 37.5 Recommande ton sort à l’Eternel, mets ta confiance en Lui, et Il agira.</w:t>
+      </w:r>
+    </w:p>
+    <w:p>
+      <w:pPr>
+        <w:pStyle w:val="Corpsdetexte"/>
+        <w:spacing w:before="90"/>
+        <w:ind w:left="145"/>
+        <w:jc w:val="both"/>
+        <w:rPr>
+          <w:rFonts w:ascii="Calibri" w:hAnsi="Calibri" w:cs="Calibri"/>
+          <w:b w:val="0"/>
+          <w:bCs w:val="0"/>
+          <w:sz w:val="28"/>
+          <w:szCs w:val="28"/>
+          <w:lang w:val="fr-BE"/>
+        </w:rPr>
+      </w:pPr>
+      <w:r>
+        <w:rPr>
+          <w:rFonts w:ascii="Calibri" w:hAnsi="Calibri" w:cs="Calibri"/>
+          <w:b w:val="0"/>
+          <w:bCs w:val="0"/>
+          <w:sz w:val="28"/>
+          <w:szCs w:val="28"/>
+          <w:lang w:val="fr-BE"/>
+        </w:rPr>
+        <w:t xml:space="preserve">Prions que DIEU accorde la grâce à tous les membres d’ICC Nivelles d’acquérir de la maturité spirituelle</w:t>
+      </w:r>
+    </w:p>
+    <w:p>
+      <w:pPr>
+        <w:pStyle w:val="Corpsdetexte"/>
+        <w:spacing w:before="90"/>
+        <w:ind w:left="145"/>
+        <w:jc w:val="both"/>
+        <w:rPr>
+          <w:rFonts w:ascii="Calibri" w:hAnsi="Calibri" w:cs="Calibri"/>
+          <w:iCs/>
+          <w:color w:val="548DD4" w:themeColor="text2" w:themeTint="99"/>
+          <w:sz w:val="28"/>
+          <w:szCs w:val="28"/>
+        </w:rPr>
+      </w:pPr>
+      <w:r>
+        <w:rPr>
+          <w:rFonts w:ascii="Calibri" w:hAnsi="Calibri" w:cs="Calibri"/>
+          <w:iCs/>
+          <w:color w:val="548DD4" w:themeColor="text2" w:themeTint="99"/>
+          <w:sz w:val="28"/>
+          <w:szCs w:val="28"/>
+        </w:rPr>
+        <w:t xml:space="preserve">Galates 4.1 Mon âme, bénis l'Éternel, et n'oublie aucun de ses bienfaits. Voici ce que je veux dire : Aussi longtemps que l’héritier est un enfant, il ne diffère en rien d’un esclave, quoiqu’il soit le maitre de tout</w:t>
+      </w:r>
+    </w:p>
+    <w:p>
+      <w:pPr>
+        <w:pStyle w:val="Corpsdetexte"/>
+        <w:spacing w:before="90"/>
+        <w:ind w:left="145"/>
+        <w:jc w:val="both"/>
+        <w:rPr>
+          <w:rFonts w:ascii="Calibri" w:hAnsi="Calibri" w:cs="Calibri"/>
+          <w:b w:val="0"/>
+          <w:bCs w:val="0"/>
+          <w:sz w:val="28"/>
+          <w:szCs w:val="28"/>
+        </w:rPr>
+      </w:pPr>
+    </w:p>
+    <w:p>
+      <w:pPr>
+        <w:ind w:left="145"/>
+        <w:rPr>
+          <w:rFonts w:ascii="Calibri" w:hAnsi="Calibri" w:cs="Calibri"/>
+          <w:b/>
+          <w:sz w:val="28"/>
+          <w:szCs w:val="28"/>
+        </w:rPr>
+      </w:pPr>
+      <w:r>
+        <w:rPr>
+          <w:rFonts w:ascii="Calibri" w:hAnsi="Calibri" w:cs="Calibri"/>
+          <w:b/>
+          <w:sz w:val="28"/>
+          <w:szCs w:val="28"/>
+        </w:rPr>
+        <w:t xml:space="preserve">5.Intercession pour le Pasteur Christian</w:t>
       </w:r>
     </w:p>
     <w:p>
@@ -2263,7 +2240,7 @@
           <w:sz w:val="28"/>
           <w:szCs w:val="28"/>
         </w:rPr>
-        <w:t xml:space="preserve">Ésaïe 40.31 Mais ceux qui comptent sur l’Eternel renouvellent leur force. Ils prennent leur envol comme les aigles. Ils courent sans s’épuiser, ils marchent sans se fatiguer.</w:t>
+        <w:t xml:space="preserve">Ésaïe 40.31 Ceux qui se confient en l’Éternel renouvellent leur force. Ils prennent le vol comme les aigles ; ils courent, et ne se lassent point, ils marchent, et ne se fatiguent point.</w:t>
       </w:r>
     </w:p>
     <w:p>
@@ -2755,7 +2732,7 @@
           <w:sz w:val="28"/>
           <w:szCs w:val="28"/>
         </w:rPr>
-        <w:t xml:space="preserve">Ésaïe 40.31 Mais ceux qui comptent sur l’Eternel renouvellent leur force. Ils prennent leur envol comme les aigles. Ils courent sans s’épuiser, ils marchent sans se fatiguer.</w:t>
+        <w:t xml:space="preserve">Ésaïe 40.31 Ceux qui se confient en l’Éternel renouvellent leur force. Ils prennent le vol comme les aigles ; ils courent, et ne se lassent point, ils marchent, et ne se fatiguent point.</w:t>
       </w:r>
     </w:p>
     <w:p>
@@ -3274,7 +3251,7 @@
           <w:sz w:val="28"/>
           <w:szCs w:val="28"/>
         </w:rPr>
-        <w:t xml:space="preserve">Ésaïe 40.31 Mais ceux qui comptent sur l’Eternel renouvellent leur force. Ils prennent leur envol comme les aigles. Ils courent sans s’épuiser, ils marchent sans se fatiguer.</w:t>
+        <w:t xml:space="preserve">Ésaïe 40.31 Ceux qui se confient en l’Éternel renouvellent leur force. Ils prennent le vol comme les aigles ; ils courent, et ne se lassent point, ils marchent, et ne se fatiguent point.</w:t>
       </w:r>
     </w:p>
     <w:p>
@@ -3843,7 +3820,7 @@
           <w:sz w:val="28"/>
           <w:szCs w:val="28"/>
         </w:rPr>
-        <w:t xml:space="preserve">Ésaïe 40.31 Mais ceux qui comptent sur l’Eternel renouvellent leur force. Ils prennent leur envol comme les aigles. Ils courent sans s’épuiser, ils marchent sans se fatiguer.</w:t>
+        <w:t xml:space="preserve">Ésaïe 40.31 Ceux qui se confient en l’Éternel renouvellent leur force. Ils prennent le vol comme les aigles ; ils courent, et ne se lassent point, ils marchent, et ne se fatiguent point.</w:t>
       </w:r>
     </w:p>
     <w:p>
@@ -4312,7 +4289,7 @@
           <w:sz w:val="28"/>
           <w:szCs w:val="28"/>
         </w:rPr>
-        <w:t xml:space="preserve">Ésaïe 40.31 Mais ceux qui comptent sur l’Eternel renouvellent leur force. Ils prennent leur envol comme les aigles. Ils courent sans s’épuiser, ils marchent sans se fatiguer.</w:t>
+        <w:t xml:space="preserve">Ésaïe 40.31 Ceux qui se confient en l’Éternel renouvellent leur force. Ils prennent le vol comme les aigles ; ils courent, et ne se lassent point, ils marchent, et ne se fatiguent point.</w:t>
       </w:r>
     </w:p>
     <w:p>
@@ -4779,7 +4756,7 @@
           <w:sz w:val="28"/>
           <w:szCs w:val="28"/>
         </w:rPr>
-        <w:t xml:space="preserve">Ésaïe 40.31 Mais ceux qui comptent sur l’Eternel renouvellent leur force. Ils prennent leur envol comme les aigles. Ils courent sans s’épuiser, ils marchent sans se fatiguer.</w:t>
+        <w:t xml:space="preserve">Ésaïe 40.31 Ceux qui se confient en l’Éternel renouvellent leur force. Ils prennent le vol comme les aigles ; ils courent, et ne se lassent point, ils marchent, et ne se fatiguent point.</w:t>
       </w:r>
     </w:p>
     <w:p>
@@ -5213,7 +5190,7 @@
           <w:sz w:val="28"/>
           <w:szCs w:val="28"/>
         </w:rPr>
-        <w:t xml:space="preserve">Ésaïe 40.31 Mais ceux qui comptent sur l’Eternel renouvellent leur force. Ils prennent leur envol comme les aigles. Ils courent sans s’épuiser, ils marchent sans se fatiguer.</w:t>
+        <w:t xml:space="preserve">Ésaïe 40.31 Ceux qui se confient en l’Éternel renouvellent leur force. Ils prennent le vol comme les aigles ; ils courent, et ne se lassent point, ils marchent, et ne se fatiguent point.</w:t>
       </w:r>
     </w:p>
     <w:p>
@@ -5682,7 +5659,7 @@
           <w:sz w:val="28"/>
           <w:szCs w:val="28"/>
         </w:rPr>
-        <w:t xml:space="preserve">Ésaïe 40.31 Mais ceux qui comptent sur l’Eternel renouvellent leur force. Ils prennent leur envol comme les aigles. Ils courent sans s’épuiser, ils marchent sans se fatiguer.</w:t>
+        <w:t xml:space="preserve">Ésaïe 40.31 Ceux qui se confient en l’Éternel renouvellent leur force. Ils prennent le vol comme les aigles ; ils courent, et ne se lassent point, ils marchent, et ne se fatiguent point.</w:t>
       </w:r>
     </w:p>
     <w:p>
@@ -6122,7 +6099,7 @@
           <w:sz w:val="28"/>
           <w:szCs w:val="28"/>
         </w:rPr>
-        <w:t xml:space="preserve">Ésaïe 40.31 Mais ceux qui comptent sur l’Eternel renouvellent leur force. Ils prennent leur envol comme les aigles. Ils courent sans s’épuiser, ils marchent sans se fatiguer.</w:t>
+        <w:t xml:space="preserve">Ésaïe 40.31 Ceux qui se confient en l’Éternel renouvellent leur force. Ils prennent le vol comme les aigles ; ils courent, et ne se lassent point, ils marchent, et ne se fatiguent point.</w:t>
       </w:r>
     </w:p>
     <w:p>

</xml_diff>